<commit_message>
Fix cover table widths so student names fit on one line
</commit_message>
<xml_diff>
--- a/reports/Assignment_1_Track_B_Report.docx
+++ b/reports/Assignment_1_Track_B_Report.docx
@@ -154,11 +154,11 @@
         <w:tblLook w:firstColumn="1" w:firstRow="1" w:lastColumn="0" w:lastRow="0" w:noHBand="0" w:noVBand="1" w:val="04A0"/>
       </w:tblPr>
       <w:tblGrid>
-        <w:gridCol w:w="1871"/>
-        <w:gridCol w:w="1871"/>
-        <w:gridCol w:w="1871"/>
-        <w:gridCol w:w="1871"/>
-        <w:gridCol w:w="1871"/>
+        <w:gridCol w:w="936"/>
+        <w:gridCol w:w="2808"/>
+        <w:gridCol w:w="1944"/>
+        <w:gridCol w:w="1224"/>
+        <w:gridCol w:w="2088"/>
       </w:tblGrid>
       <w:tr>
         <w:trPr>
@@ -166,12 +166,13 @@
         </w:trPr>
         <w:tc>
           <w:tcPr>
-            <w:tcW w:type="dxa" w:w="749"/>
+            <w:tcW w:type="dxa" w:w="936"/>
             <w:shd w:fill="EAF2EF"/>
           </w:tcPr>
           <w:p>
             <w:pPr>
               <w:spacing w:line="252" w:lineRule="auto" w:after="80" w:before="80"/>
+              <w:jc w:val="left"/>
             </w:pPr>
             <w:r>
               <w:rPr>
@@ -184,12 +185,13 @@
         </w:tc>
         <w:tc>
           <w:tcPr>
-            <w:tcW w:type="dxa" w:w="2376"/>
+            <w:tcW w:type="dxa" w:w="2808"/>
             <w:shd w:fill="EAF2EF"/>
           </w:tcPr>
           <w:p>
             <w:pPr>
               <w:spacing w:line="252" w:lineRule="auto" w:after="80" w:before="80"/>
+              <w:jc w:val="left"/>
             </w:pPr>
             <w:r>
               <w:rPr>
@@ -202,12 +204,13 @@
         </w:tc>
         <w:tc>
           <w:tcPr>
-            <w:tcW w:type="dxa" w:w="2016"/>
+            <w:tcW w:type="dxa" w:w="1944"/>
             <w:shd w:fill="EAF2EF"/>
           </w:tcPr>
           <w:p>
             <w:pPr>
               <w:spacing w:line="252" w:lineRule="auto" w:after="80" w:before="80"/>
+              <w:jc w:val="left"/>
             </w:pPr>
             <w:r>
               <w:rPr>
@@ -220,12 +223,13 @@
         </w:tc>
         <w:tc>
           <w:tcPr>
-            <w:tcW w:type="dxa" w:w="864"/>
+            <w:tcW w:type="dxa" w:w="1224"/>
             <w:shd w:fill="EAF2EF"/>
           </w:tcPr>
           <w:p>
             <w:pPr>
               <w:spacing w:line="252" w:lineRule="auto" w:after="80" w:before="80"/>
+              <w:jc w:val="left"/>
             </w:pPr>
             <w:r>
               <w:rPr>
@@ -238,12 +242,13 @@
         </w:tc>
         <w:tc>
           <w:tcPr>
-            <w:tcW w:type="dxa" w:w="1584"/>
+            <w:tcW w:type="dxa" w:w="2088"/>
             <w:shd w:fill="EAF2EF"/>
           </w:tcPr>
           <w:p>
             <w:pPr>
               <w:spacing w:line="252" w:lineRule="auto" w:after="80" w:before="80"/>
+              <w:jc w:val="left"/>
             </w:pPr>
             <w:r>
               <w:rPr>
@@ -261,11 +266,12 @@
         </w:trPr>
         <w:tc>
           <w:tcPr>
-            <w:tcW w:type="dxa" w:w="749"/>
+            <w:tcW w:type="dxa" w:w="936"/>
           </w:tcPr>
           <w:p>
             <w:pPr>
               <w:spacing w:line="252" w:lineRule="auto" w:after="80" w:before="80"/>
+              <w:jc w:val="left"/>
             </w:pPr>
             <w:r>
               <w:rPr>
@@ -278,11 +284,12 @@
         </w:tc>
         <w:tc>
           <w:tcPr>
-            <w:tcW w:type="dxa" w:w="2376"/>
+            <w:tcW w:type="dxa" w:w="2808"/>
           </w:tcPr>
           <w:p>
             <w:pPr>
               <w:spacing w:line="252" w:lineRule="auto" w:after="80" w:before="80"/>
+              <w:jc w:val="left"/>
             </w:pPr>
             <w:r>
               <w:rPr>
@@ -295,11 +302,12 @@
         </w:tc>
         <w:tc>
           <w:tcPr>
-            <w:tcW w:type="dxa" w:w="2016"/>
+            <w:tcW w:type="dxa" w:w="1944"/>
           </w:tcPr>
           <w:p>
             <w:pPr>
               <w:spacing w:line="252" w:lineRule="auto" w:after="80" w:before="80"/>
+              <w:jc w:val="left"/>
             </w:pPr>
             <w:r>
               <w:rPr>
@@ -312,11 +320,12 @@
         </w:tc>
         <w:tc>
           <w:tcPr>
-            <w:tcW w:type="dxa" w:w="864"/>
+            <w:tcW w:type="dxa" w:w="1224"/>
           </w:tcPr>
           <w:p>
             <w:pPr>
               <w:spacing w:line="252" w:lineRule="auto" w:after="80" w:before="80"/>
+              <w:jc w:val="left"/>
             </w:pPr>
             <w:r>
               <w:rPr>
@@ -328,11 +337,12 @@
         </w:tc>
         <w:tc>
           <w:tcPr>
-            <w:tcW w:type="dxa" w:w="1584"/>
+            <w:tcW w:type="dxa" w:w="2088"/>
           </w:tcPr>
           <w:p>
             <w:pPr>
               <w:spacing w:line="252" w:lineRule="auto" w:after="80" w:before="80"/>
+              <w:jc w:val="left"/>
             </w:pPr>
             <w:r>
               <w:rPr>
@@ -349,11 +359,12 @@
         </w:trPr>
         <w:tc>
           <w:tcPr>
-            <w:tcW w:type="dxa" w:w="749"/>
+            <w:tcW w:type="dxa" w:w="936"/>
           </w:tcPr>
           <w:p>
             <w:pPr>
               <w:spacing w:line="252" w:lineRule="auto" w:after="80" w:before="80"/>
+              <w:jc w:val="left"/>
             </w:pPr>
             <w:r>
               <w:rPr>
@@ -366,11 +377,12 @@
         </w:tc>
         <w:tc>
           <w:tcPr>
-            <w:tcW w:type="dxa" w:w="2376"/>
+            <w:tcW w:type="dxa" w:w="2808"/>
           </w:tcPr>
           <w:p>
             <w:pPr>
               <w:spacing w:line="252" w:lineRule="auto" w:after="80" w:before="80"/>
+              <w:jc w:val="left"/>
             </w:pPr>
             <w:r>
               <w:rPr>
@@ -383,11 +395,12 @@
         </w:tc>
         <w:tc>
           <w:tcPr>
-            <w:tcW w:type="dxa" w:w="2016"/>
+            <w:tcW w:type="dxa" w:w="1944"/>
           </w:tcPr>
           <w:p>
             <w:pPr>
               <w:spacing w:line="252" w:lineRule="auto" w:after="80" w:before="80"/>
+              <w:jc w:val="left"/>
             </w:pPr>
             <w:r>
               <w:rPr>
@@ -400,11 +413,12 @@
         </w:tc>
         <w:tc>
           <w:tcPr>
-            <w:tcW w:type="dxa" w:w="864"/>
+            <w:tcW w:type="dxa" w:w="1224"/>
           </w:tcPr>
           <w:p>
             <w:pPr>
               <w:spacing w:line="252" w:lineRule="auto" w:after="80" w:before="80"/>
+              <w:jc w:val="left"/>
             </w:pPr>
             <w:r>
               <w:rPr>
@@ -416,11 +430,12 @@
         </w:tc>
         <w:tc>
           <w:tcPr>
-            <w:tcW w:type="dxa" w:w="1584"/>
+            <w:tcW w:type="dxa" w:w="2088"/>
           </w:tcPr>
           <w:p>
             <w:pPr>
               <w:spacing w:line="252" w:lineRule="auto" w:after="80" w:before="80"/>
+              <w:jc w:val="left"/>
             </w:pPr>
             <w:r>
               <w:rPr>
@@ -437,11 +452,12 @@
         </w:trPr>
         <w:tc>
           <w:tcPr>
-            <w:tcW w:type="dxa" w:w="749"/>
+            <w:tcW w:type="dxa" w:w="936"/>
           </w:tcPr>
           <w:p>
             <w:pPr>
               <w:spacing w:line="252" w:lineRule="auto" w:after="80" w:before="80"/>
+              <w:jc w:val="left"/>
             </w:pPr>
             <w:r>
               <w:rPr>
@@ -454,11 +470,12 @@
         </w:tc>
         <w:tc>
           <w:tcPr>
-            <w:tcW w:type="dxa" w:w="2376"/>
+            <w:tcW w:type="dxa" w:w="2808"/>
           </w:tcPr>
           <w:p>
             <w:pPr>
               <w:spacing w:line="252" w:lineRule="auto" w:after="80" w:before="80"/>
+              <w:jc w:val="left"/>
             </w:pPr>
             <w:r>
               <w:rPr>
@@ -471,11 +488,12 @@
         </w:tc>
         <w:tc>
           <w:tcPr>
-            <w:tcW w:type="dxa" w:w="2016"/>
+            <w:tcW w:type="dxa" w:w="1944"/>
           </w:tcPr>
           <w:p>
             <w:pPr>
               <w:spacing w:line="252" w:lineRule="auto" w:after="80" w:before="80"/>
+              <w:jc w:val="left"/>
             </w:pPr>
             <w:r>
               <w:rPr>
@@ -488,11 +506,12 @@
         </w:tc>
         <w:tc>
           <w:tcPr>
-            <w:tcW w:type="dxa" w:w="864"/>
+            <w:tcW w:type="dxa" w:w="1224"/>
           </w:tcPr>
           <w:p>
             <w:pPr>
               <w:spacing w:line="252" w:lineRule="auto" w:after="80" w:before="80"/>
+              <w:jc w:val="left"/>
             </w:pPr>
             <w:r>
               <w:rPr>
@@ -504,11 +523,12 @@
         </w:tc>
         <w:tc>
           <w:tcPr>
-            <w:tcW w:type="dxa" w:w="1584"/>
+            <w:tcW w:type="dxa" w:w="2088"/>
           </w:tcPr>
           <w:p>
             <w:pPr>
               <w:spacing w:line="252" w:lineRule="auto" w:after="80" w:before="80"/>
+              <w:jc w:val="left"/>
             </w:pPr>
             <w:r>
               <w:rPr>
@@ -659,8 +679,8 @@
         <w:tblLook w:firstColumn="1" w:firstRow="1" w:lastColumn="0" w:lastRow="0" w:noHBand="0" w:noVBand="1" w:val="04A0"/>
       </w:tblPr>
       <w:tblGrid>
-        <w:gridCol w:w="4677"/>
-        <w:gridCol w:w="4677"/>
+        <w:gridCol w:w="7992"/>
+        <w:gridCol w:w="1152"/>
       </w:tblGrid>
       <w:tr>
         <w:trPr>
@@ -674,6 +694,7 @@
           <w:p>
             <w:pPr>
               <w:spacing w:line="252" w:lineRule="auto" w:after="80" w:before="80"/>
+              <w:jc w:val="left"/>
             </w:pPr>
             <w:r>
               <w:rPr>
@@ -692,6 +713,7 @@
           <w:p>
             <w:pPr>
               <w:spacing w:line="252" w:lineRule="auto" w:after="80" w:before="80"/>
+              <w:jc w:val="left"/>
             </w:pPr>
             <w:r>
               <w:rPr>
@@ -714,6 +736,7 @@
           <w:p>
             <w:pPr>
               <w:spacing w:line="252" w:lineRule="auto" w:after="80" w:before="80"/>
+              <w:jc w:val="left"/>
             </w:pPr>
             <w:r>
               <w:rPr>
@@ -731,6 +754,7 @@
           <w:p>
             <w:pPr>
               <w:spacing w:line="252" w:lineRule="auto" w:after="80" w:before="80"/>
+              <w:jc w:val="left"/>
             </w:pPr>
             <w:r>
               <w:rPr>
@@ -753,6 +777,7 @@
           <w:p>
             <w:pPr>
               <w:spacing w:line="252" w:lineRule="auto" w:after="80" w:before="80"/>
+              <w:jc w:val="left"/>
             </w:pPr>
             <w:r>
               <w:rPr>
@@ -770,6 +795,7 @@
           <w:p>
             <w:pPr>
               <w:spacing w:line="252" w:lineRule="auto" w:after="80" w:before="80"/>
+              <w:jc w:val="left"/>
             </w:pPr>
             <w:r>
               <w:rPr>
@@ -792,6 +818,7 @@
           <w:p>
             <w:pPr>
               <w:spacing w:line="252" w:lineRule="auto" w:after="80" w:before="80"/>
+              <w:jc w:val="left"/>
             </w:pPr>
             <w:r>
               <w:rPr>
@@ -809,6 +836,7 @@
           <w:p>
             <w:pPr>
               <w:spacing w:line="252" w:lineRule="auto" w:after="80" w:before="80"/>
+              <w:jc w:val="left"/>
             </w:pPr>
             <w:r>
               <w:rPr>
@@ -831,6 +859,7 @@
           <w:p>
             <w:pPr>
               <w:spacing w:line="252" w:lineRule="auto" w:after="80" w:before="80"/>
+              <w:jc w:val="left"/>
             </w:pPr>
             <w:r>
               <w:rPr>
@@ -848,6 +877,7 @@
           <w:p>
             <w:pPr>
               <w:spacing w:line="252" w:lineRule="auto" w:after="80" w:before="80"/>
+              <w:jc w:val="left"/>
             </w:pPr>
             <w:r>
               <w:rPr>
@@ -870,6 +900,7 @@
           <w:p>
             <w:pPr>
               <w:spacing w:line="252" w:lineRule="auto" w:after="80" w:before="80"/>
+              <w:jc w:val="left"/>
             </w:pPr>
             <w:r>
               <w:rPr>
@@ -887,6 +918,7 @@
           <w:p>
             <w:pPr>
               <w:spacing w:line="252" w:lineRule="auto" w:after="80" w:before="80"/>
+              <w:jc w:val="left"/>
             </w:pPr>
             <w:r>
               <w:rPr>
@@ -909,6 +941,7 @@
           <w:p>
             <w:pPr>
               <w:spacing w:line="252" w:lineRule="auto" w:after="80" w:before="80"/>
+              <w:jc w:val="left"/>
             </w:pPr>
             <w:r>
               <w:rPr>
@@ -926,6 +959,7 @@
           <w:p>
             <w:pPr>
               <w:spacing w:line="252" w:lineRule="auto" w:after="80" w:before="80"/>
+              <w:jc w:val="left"/>
             </w:pPr>
             <w:r>
               <w:rPr>
@@ -948,6 +982,7 @@
           <w:p>
             <w:pPr>
               <w:spacing w:line="252" w:lineRule="auto" w:after="80" w:before="80"/>
+              <w:jc w:val="left"/>
             </w:pPr>
             <w:r>
               <w:rPr>
@@ -965,6 +1000,7 @@
           <w:p>
             <w:pPr>
               <w:spacing w:line="252" w:lineRule="auto" w:after="80" w:before="80"/>
+              <w:jc w:val="left"/>
             </w:pPr>
             <w:r>
               <w:rPr>
@@ -987,6 +1023,7 @@
           <w:p>
             <w:pPr>
               <w:spacing w:line="252" w:lineRule="auto" w:after="80" w:before="80"/>
+              <w:jc w:val="left"/>
             </w:pPr>
             <w:r>
               <w:rPr>
@@ -1004,6 +1041,7 @@
           <w:p>
             <w:pPr>
               <w:spacing w:line="252" w:lineRule="auto" w:after="80" w:before="80"/>
+              <w:jc w:val="left"/>
             </w:pPr>
             <w:r>
               <w:rPr>
@@ -1078,9 +1116,9 @@
         <w:tblLook w:firstColumn="1" w:firstRow="1" w:lastColumn="0" w:lastRow="0" w:noHBand="0" w:noVBand="1" w:val="04A0"/>
       </w:tblPr>
       <w:tblGrid>
-        <w:gridCol w:w="3118"/>
-        <w:gridCol w:w="3118"/>
-        <w:gridCol w:w="3118"/>
+        <w:gridCol w:w="3384"/>
+        <w:gridCol w:w="2736"/>
+        <w:gridCol w:w="2880"/>
       </w:tblGrid>
       <w:tr>
         <w:trPr>
@@ -1094,6 +1132,7 @@
           <w:p>
             <w:pPr>
               <w:spacing w:line="252" w:lineRule="auto" w:after="80" w:before="80"/>
+              <w:jc w:val="left"/>
             </w:pPr>
             <w:r>
               <w:rPr>
@@ -1112,6 +1151,7 @@
           <w:p>
             <w:pPr>
               <w:spacing w:line="252" w:lineRule="auto" w:after="80" w:before="80"/>
+              <w:jc w:val="left"/>
             </w:pPr>
             <w:r>
               <w:rPr>
@@ -1130,6 +1170,7 @@
           <w:p>
             <w:pPr>
               <w:spacing w:line="252" w:lineRule="auto" w:after="80" w:before="80"/>
+              <w:jc w:val="left"/>
             </w:pPr>
             <w:r>
               <w:rPr>
@@ -1152,6 +1193,7 @@
           <w:p>
             <w:pPr>
               <w:spacing w:line="252" w:lineRule="auto" w:after="80" w:before="80"/>
+              <w:jc w:val="left"/>
             </w:pPr>
             <w:r>
               <w:rPr>
@@ -1169,6 +1211,7 @@
           <w:p>
             <w:pPr>
               <w:spacing w:line="252" w:lineRule="auto" w:after="80" w:before="80"/>
+              <w:jc w:val="left"/>
             </w:pPr>
             <w:r>
               <w:rPr>
@@ -1186,6 +1229,7 @@
           <w:p>
             <w:pPr>
               <w:spacing w:line="252" w:lineRule="auto" w:after="80" w:before="80"/>
+              <w:jc w:val="left"/>
             </w:pPr>
             <w:r>
               <w:rPr>
@@ -1208,6 +1252,7 @@
           <w:p>
             <w:pPr>
               <w:spacing w:line="252" w:lineRule="auto" w:after="80" w:before="80"/>
+              <w:jc w:val="left"/>
             </w:pPr>
             <w:r>
               <w:rPr>
@@ -1225,6 +1270,7 @@
           <w:p>
             <w:pPr>
               <w:spacing w:line="252" w:lineRule="auto" w:after="80" w:before="80"/>
+              <w:jc w:val="left"/>
             </w:pPr>
             <w:r>
               <w:rPr>
@@ -1242,6 +1288,7 @@
           <w:p>
             <w:pPr>
               <w:spacing w:line="252" w:lineRule="auto" w:after="80" w:before="80"/>
+              <w:jc w:val="left"/>
             </w:pPr>
             <w:r>
               <w:rPr>
@@ -1264,6 +1311,7 @@
           <w:p>
             <w:pPr>
               <w:spacing w:line="252" w:lineRule="auto" w:after="80" w:before="80"/>
+              <w:jc w:val="left"/>
             </w:pPr>
             <w:r>
               <w:rPr>
@@ -1281,6 +1329,7 @@
           <w:p>
             <w:pPr>
               <w:spacing w:line="252" w:lineRule="auto" w:after="80" w:before="80"/>
+              <w:jc w:val="left"/>
             </w:pPr>
             <w:r>
               <w:rPr>
@@ -1298,6 +1347,7 @@
           <w:p>
             <w:pPr>
               <w:spacing w:line="252" w:lineRule="auto" w:after="80" w:before="80"/>
+              <w:jc w:val="left"/>
             </w:pPr>
             <w:r>
               <w:rPr>
@@ -1320,6 +1370,7 @@
           <w:p>
             <w:pPr>
               <w:spacing w:line="252" w:lineRule="auto" w:after="80" w:before="80"/>
+              <w:jc w:val="left"/>
             </w:pPr>
             <w:r>
               <w:rPr>
@@ -1337,6 +1388,7 @@
           <w:p>
             <w:pPr>
               <w:spacing w:line="252" w:lineRule="auto" w:after="80" w:before="80"/>
+              <w:jc w:val="left"/>
             </w:pPr>
             <w:r>
               <w:rPr>
@@ -1354,6 +1406,7 @@
           <w:p>
             <w:pPr>
               <w:spacing w:line="252" w:lineRule="auto" w:after="80" w:before="80"/>
+              <w:jc w:val="left"/>
             </w:pPr>
             <w:r>
               <w:rPr>
@@ -1428,8 +1481,8 @@
         <w:tblLook w:firstColumn="1" w:firstRow="1" w:lastColumn="0" w:lastRow="0" w:noHBand="0" w:noVBand="1" w:val="04A0"/>
       </w:tblPr>
       <w:tblGrid>
-        <w:gridCol w:w="4677"/>
-        <w:gridCol w:w="4677"/>
+        <w:gridCol w:w="2160"/>
+        <w:gridCol w:w="6840"/>
       </w:tblGrid>
       <w:tr>
         <w:trPr>
@@ -1443,6 +1496,7 @@
           <w:p>
             <w:pPr>
               <w:spacing w:line="252" w:lineRule="auto" w:after="80" w:before="80"/>
+              <w:jc w:val="left"/>
             </w:pPr>
             <w:r>
               <w:rPr>
@@ -1461,6 +1515,7 @@
           <w:p>
             <w:pPr>
               <w:spacing w:line="252" w:lineRule="auto" w:after="80" w:before="80"/>
+              <w:jc w:val="left"/>
             </w:pPr>
             <w:r>
               <w:rPr>
@@ -1483,6 +1538,7 @@
           <w:p>
             <w:pPr>
               <w:spacing w:line="252" w:lineRule="auto" w:after="80" w:before="80"/>
+              <w:jc w:val="left"/>
             </w:pPr>
             <w:r>
               <w:rPr>
@@ -1500,6 +1556,7 @@
           <w:p>
             <w:pPr>
               <w:spacing w:line="252" w:lineRule="auto" w:after="80" w:before="80"/>
+              <w:jc w:val="left"/>
             </w:pPr>
             <w:r>
               <w:rPr>
@@ -1522,6 +1579,7 @@
           <w:p>
             <w:pPr>
               <w:spacing w:line="252" w:lineRule="auto" w:after="80" w:before="80"/>
+              <w:jc w:val="left"/>
             </w:pPr>
             <w:r>
               <w:rPr>
@@ -1539,6 +1597,7 @@
           <w:p>
             <w:pPr>
               <w:spacing w:line="252" w:lineRule="auto" w:after="80" w:before="80"/>
+              <w:jc w:val="left"/>
             </w:pPr>
             <w:r>
               <w:rPr>
@@ -1561,6 +1620,7 @@
           <w:p>
             <w:pPr>
               <w:spacing w:line="252" w:lineRule="auto" w:after="80" w:before="80"/>
+              <w:jc w:val="left"/>
             </w:pPr>
             <w:r>
               <w:rPr>
@@ -1578,6 +1638,7 @@
           <w:p>
             <w:pPr>
               <w:spacing w:line="252" w:lineRule="auto" w:after="80" w:before="80"/>
+              <w:jc w:val="left"/>
             </w:pPr>
             <w:r>
               <w:rPr>
@@ -1600,6 +1661,7 @@
           <w:p>
             <w:pPr>
               <w:spacing w:line="252" w:lineRule="auto" w:after="80" w:before="80"/>
+              <w:jc w:val="left"/>
             </w:pPr>
             <w:r>
               <w:rPr>
@@ -1617,6 +1679,7 @@
           <w:p>
             <w:pPr>
               <w:spacing w:line="252" w:lineRule="auto" w:after="80" w:before="80"/>
+              <w:jc w:val="left"/>
             </w:pPr>
             <w:r>
               <w:rPr>
@@ -1639,6 +1702,7 @@
           <w:p>
             <w:pPr>
               <w:spacing w:line="252" w:lineRule="auto" w:after="80" w:before="80"/>
+              <w:jc w:val="left"/>
             </w:pPr>
             <w:r>
               <w:rPr>
@@ -1656,6 +1720,7 @@
           <w:p>
             <w:pPr>
               <w:spacing w:line="252" w:lineRule="auto" w:after="80" w:before="80"/>
+              <w:jc w:val="left"/>
             </w:pPr>
             <w:r>
               <w:rPr>
@@ -1786,8 +1851,8 @@
         <w:tblLook w:firstColumn="1" w:firstRow="1" w:lastColumn="0" w:lastRow="0" w:noHBand="0" w:noVBand="1" w:val="04A0"/>
       </w:tblPr>
       <w:tblGrid>
-        <w:gridCol w:w="4677"/>
-        <w:gridCol w:w="4677"/>
+        <w:gridCol w:w="1584"/>
+        <w:gridCol w:w="7416"/>
       </w:tblGrid>
       <w:tr>
         <w:trPr>
@@ -1801,6 +1866,7 @@
           <w:p>
             <w:pPr>
               <w:spacing w:line="252" w:lineRule="auto" w:after="80" w:before="80"/>
+              <w:jc w:val="left"/>
             </w:pPr>
             <w:r>
               <w:rPr>
@@ -1819,6 +1885,7 @@
           <w:p>
             <w:pPr>
               <w:spacing w:line="252" w:lineRule="auto" w:after="80" w:before="80"/>
+              <w:jc w:val="left"/>
             </w:pPr>
             <w:r>
               <w:rPr>
@@ -1841,6 +1908,7 @@
           <w:p>
             <w:pPr>
               <w:spacing w:line="252" w:lineRule="auto" w:after="80" w:before="80"/>
+              <w:jc w:val="left"/>
             </w:pPr>
             <w:r>
               <w:rPr>
@@ -1858,6 +1926,7 @@
           <w:p>
             <w:pPr>
               <w:spacing w:line="252" w:lineRule="auto" w:after="80" w:before="80"/>
+              <w:jc w:val="left"/>
             </w:pPr>
             <w:r>
               <w:rPr>
@@ -1880,6 +1949,7 @@
           <w:p>
             <w:pPr>
               <w:spacing w:line="252" w:lineRule="auto" w:after="80" w:before="80"/>
+              <w:jc w:val="left"/>
             </w:pPr>
             <w:r>
               <w:rPr>
@@ -1897,6 +1967,7 @@
           <w:p>
             <w:pPr>
               <w:spacing w:line="252" w:lineRule="auto" w:after="80" w:before="80"/>
+              <w:jc w:val="left"/>
             </w:pPr>
             <w:r>
               <w:rPr>
@@ -1919,6 +1990,7 @@
           <w:p>
             <w:pPr>
               <w:spacing w:line="252" w:lineRule="auto" w:after="80" w:before="80"/>
+              <w:jc w:val="left"/>
             </w:pPr>
             <w:r>
               <w:rPr>
@@ -1936,6 +2008,7 @@
           <w:p>
             <w:pPr>
               <w:spacing w:line="252" w:lineRule="auto" w:after="80" w:before="80"/>
+              <w:jc w:val="left"/>
             </w:pPr>
             <w:r>
               <w:rPr>
@@ -1958,6 +2031,7 @@
           <w:p>
             <w:pPr>
               <w:spacing w:line="252" w:lineRule="auto" w:after="80" w:before="80"/>
+              <w:jc w:val="left"/>
             </w:pPr>
             <w:r>
               <w:rPr>
@@ -1975,6 +2049,7 @@
           <w:p>
             <w:pPr>
               <w:spacing w:line="252" w:lineRule="auto" w:after="80" w:before="80"/>
+              <w:jc w:val="left"/>
             </w:pPr>
             <w:r>
               <w:rPr>
@@ -1997,6 +2072,7 @@
           <w:p>
             <w:pPr>
               <w:spacing w:line="252" w:lineRule="auto" w:after="80" w:before="80"/>
+              <w:jc w:val="left"/>
             </w:pPr>
             <w:r>
               <w:rPr>
@@ -2014,6 +2090,7 @@
           <w:p>
             <w:pPr>
               <w:spacing w:line="252" w:lineRule="auto" w:after="80" w:before="80"/>
+              <w:jc w:val="left"/>
             </w:pPr>
             <w:r>
               <w:rPr>
@@ -2088,11 +2165,11 @@
         <w:tblLook w:firstColumn="1" w:firstRow="1" w:lastColumn="0" w:lastRow="0" w:noHBand="0" w:noVBand="1" w:val="04A0"/>
       </w:tblPr>
       <w:tblGrid>
-        <w:gridCol w:w="1871"/>
-        <w:gridCol w:w="1871"/>
-        <w:gridCol w:w="1871"/>
-        <w:gridCol w:w="1871"/>
-        <w:gridCol w:w="1871"/>
+        <w:gridCol w:w="2376"/>
+        <w:gridCol w:w="1800"/>
+        <w:gridCol w:w="1584"/>
+        <w:gridCol w:w="1440"/>
+        <w:gridCol w:w="1800"/>
       </w:tblGrid>
       <w:tr>
         <w:trPr>
@@ -2106,6 +2183,7 @@
           <w:p>
             <w:pPr>
               <w:spacing w:line="252" w:lineRule="auto" w:after="80" w:before="80"/>
+              <w:jc w:val="left"/>
             </w:pPr>
             <w:r>
               <w:rPr>
@@ -2124,6 +2202,7 @@
           <w:p>
             <w:pPr>
               <w:spacing w:line="252" w:lineRule="auto" w:after="80" w:before="80"/>
+              <w:jc w:val="left"/>
             </w:pPr>
             <w:r>
               <w:rPr>
@@ -2142,6 +2221,7 @@
           <w:p>
             <w:pPr>
               <w:spacing w:line="252" w:lineRule="auto" w:after="80" w:before="80"/>
+              <w:jc w:val="left"/>
             </w:pPr>
             <w:r>
               <w:rPr>
@@ -2160,6 +2240,7 @@
           <w:p>
             <w:pPr>
               <w:spacing w:line="252" w:lineRule="auto" w:after="80" w:before="80"/>
+              <w:jc w:val="left"/>
             </w:pPr>
             <w:r>
               <w:rPr>
@@ -2178,6 +2259,7 @@
           <w:p>
             <w:pPr>
               <w:spacing w:line="252" w:lineRule="auto" w:after="80" w:before="80"/>
+              <w:jc w:val="left"/>
             </w:pPr>
             <w:r>
               <w:rPr>
@@ -2200,6 +2282,7 @@
           <w:p>
             <w:pPr>
               <w:spacing w:line="252" w:lineRule="auto" w:after="80" w:before="80"/>
+              <w:jc w:val="left"/>
             </w:pPr>
             <w:r>
               <w:rPr>
@@ -2217,6 +2300,7 @@
           <w:p>
             <w:pPr>
               <w:spacing w:line="252" w:lineRule="auto" w:after="80" w:before="80"/>
+              <w:jc w:val="left"/>
             </w:pPr>
             <w:r>
               <w:rPr>
@@ -2234,6 +2318,7 @@
           <w:p>
             <w:pPr>
               <w:spacing w:line="252" w:lineRule="auto" w:after="80" w:before="80"/>
+              <w:jc w:val="left"/>
             </w:pPr>
             <w:r>
               <w:rPr>
@@ -2251,6 +2336,7 @@
           <w:p>
             <w:pPr>
               <w:spacing w:line="252" w:lineRule="auto" w:after="80" w:before="80"/>
+              <w:jc w:val="left"/>
             </w:pPr>
             <w:r>
               <w:rPr>
@@ -2268,6 +2354,7 @@
           <w:p>
             <w:pPr>
               <w:spacing w:line="252" w:lineRule="auto" w:after="80" w:before="80"/>
+              <w:jc w:val="left"/>
             </w:pPr>
             <w:r>
               <w:rPr>
@@ -2290,6 +2377,7 @@
           <w:p>
             <w:pPr>
               <w:spacing w:line="252" w:lineRule="auto" w:after="80" w:before="80"/>
+              <w:jc w:val="left"/>
             </w:pPr>
             <w:r>
               <w:rPr>
@@ -2307,6 +2395,7 @@
           <w:p>
             <w:pPr>
               <w:spacing w:line="252" w:lineRule="auto" w:after="80" w:before="80"/>
+              <w:jc w:val="left"/>
             </w:pPr>
             <w:r>
               <w:rPr>
@@ -2324,6 +2413,7 @@
           <w:p>
             <w:pPr>
               <w:spacing w:line="252" w:lineRule="auto" w:after="80" w:before="80"/>
+              <w:jc w:val="left"/>
             </w:pPr>
             <w:r>
               <w:rPr>
@@ -2341,6 +2431,7 @@
           <w:p>
             <w:pPr>
               <w:spacing w:line="252" w:lineRule="auto" w:after="80" w:before="80"/>
+              <w:jc w:val="left"/>
             </w:pPr>
             <w:r>
               <w:rPr>
@@ -2358,6 +2449,7 @@
           <w:p>
             <w:pPr>
               <w:spacing w:line="252" w:lineRule="auto" w:after="80" w:before="80"/>
+              <w:jc w:val="left"/>
             </w:pPr>
             <w:r>
               <w:rPr>
@@ -2397,8 +2489,8 @@
         <w:tblLook w:firstColumn="1" w:firstRow="1" w:lastColumn="0" w:lastRow="0" w:noHBand="0" w:noVBand="1" w:val="04A0"/>
       </w:tblPr>
       <w:tblGrid>
-        <w:gridCol w:w="4677"/>
-        <w:gridCol w:w="4677"/>
+        <w:gridCol w:w="6624"/>
+        <w:gridCol w:w="2376"/>
       </w:tblGrid>
       <w:tr>
         <w:trPr>
@@ -2412,6 +2504,7 @@
           <w:p>
             <w:pPr>
               <w:spacing w:line="252" w:lineRule="auto" w:after="80" w:before="80"/>
+              <w:jc w:val="left"/>
             </w:pPr>
             <w:r>
               <w:rPr>
@@ -2430,6 +2523,7 @@
           <w:p>
             <w:pPr>
               <w:spacing w:line="252" w:lineRule="auto" w:after="80" w:before="80"/>
+              <w:jc w:val="left"/>
             </w:pPr>
             <w:r>
               <w:rPr>
@@ -2452,6 +2546,7 @@
           <w:p>
             <w:pPr>
               <w:spacing w:line="252" w:lineRule="auto" w:after="80" w:before="80"/>
+              <w:jc w:val="left"/>
             </w:pPr>
             <w:r>
               <w:rPr>
@@ -2469,6 +2564,7 @@
           <w:p>
             <w:pPr>
               <w:spacing w:line="252" w:lineRule="auto" w:after="80" w:before="80"/>
+              <w:jc w:val="left"/>
             </w:pPr>
             <w:r>
               <w:rPr>
@@ -2491,6 +2587,7 @@
           <w:p>
             <w:pPr>
               <w:spacing w:line="252" w:lineRule="auto" w:after="80" w:before="80"/>
+              <w:jc w:val="left"/>
             </w:pPr>
             <w:r>
               <w:rPr>
@@ -2508,6 +2605,7 @@
           <w:p>
             <w:pPr>
               <w:spacing w:line="252" w:lineRule="auto" w:after="80" w:before="80"/>
+              <w:jc w:val="left"/>
             </w:pPr>
             <w:r>
               <w:rPr>
@@ -2530,6 +2628,7 @@
           <w:p>
             <w:pPr>
               <w:spacing w:line="252" w:lineRule="auto" w:after="80" w:before="80"/>
+              <w:jc w:val="left"/>
             </w:pPr>
             <w:r>
               <w:rPr>
@@ -2547,6 +2646,7 @@
           <w:p>
             <w:pPr>
               <w:spacing w:line="252" w:lineRule="auto" w:after="80" w:before="80"/>
+              <w:jc w:val="left"/>
             </w:pPr>
             <w:r>
               <w:rPr>
@@ -2569,6 +2669,7 @@
           <w:p>
             <w:pPr>
               <w:spacing w:line="252" w:lineRule="auto" w:after="80" w:before="80"/>
+              <w:jc w:val="left"/>
             </w:pPr>
             <w:r>
               <w:rPr>
@@ -2586,6 +2687,7 @@
           <w:p>
             <w:pPr>
               <w:spacing w:line="252" w:lineRule="auto" w:after="80" w:before="80"/>
+              <w:jc w:val="left"/>
             </w:pPr>
             <w:r>
               <w:rPr>
@@ -2608,6 +2710,7 @@
           <w:p>
             <w:pPr>
               <w:spacing w:line="252" w:lineRule="auto" w:after="80" w:before="80"/>
+              <w:jc w:val="left"/>
             </w:pPr>
             <w:r>
               <w:rPr>
@@ -2625,6 +2728,7 @@
           <w:p>
             <w:pPr>
               <w:spacing w:line="252" w:lineRule="auto" w:after="80" w:before="80"/>
+              <w:jc w:val="left"/>
             </w:pPr>
             <w:r>
               <w:rPr>
@@ -2718,8 +2822,8 @@
         <w:tblLook w:firstColumn="1" w:firstRow="1" w:lastColumn="0" w:lastRow="0" w:noHBand="0" w:noVBand="1" w:val="04A0"/>
       </w:tblPr>
       <w:tblGrid>
-        <w:gridCol w:w="4677"/>
-        <w:gridCol w:w="4677"/>
+        <w:gridCol w:w="1872"/>
+        <w:gridCol w:w="7128"/>
       </w:tblGrid>
       <w:tr>
         <w:trPr>
@@ -2733,6 +2837,7 @@
           <w:p>
             <w:pPr>
               <w:spacing w:line="252" w:lineRule="auto" w:after="80" w:before="80"/>
+              <w:jc w:val="left"/>
             </w:pPr>
             <w:r>
               <w:rPr>
@@ -2751,6 +2856,7 @@
           <w:p>
             <w:pPr>
               <w:spacing w:line="252" w:lineRule="auto" w:after="80" w:before="80"/>
+              <w:jc w:val="left"/>
             </w:pPr>
             <w:r>
               <w:rPr>
@@ -2773,6 +2879,7 @@
           <w:p>
             <w:pPr>
               <w:spacing w:line="252" w:lineRule="auto" w:after="80" w:before="80"/>
+              <w:jc w:val="left"/>
             </w:pPr>
             <w:r>
               <w:rPr>
@@ -2790,6 +2897,7 @@
           <w:p>
             <w:pPr>
               <w:spacing w:line="252" w:lineRule="auto" w:after="80" w:before="80"/>
+              <w:jc w:val="left"/>
             </w:pPr>
             <w:r>
               <w:rPr>
@@ -2812,6 +2920,7 @@
           <w:p>
             <w:pPr>
               <w:spacing w:line="252" w:lineRule="auto" w:after="80" w:before="80"/>
+              <w:jc w:val="left"/>
             </w:pPr>
             <w:r>
               <w:rPr>
@@ -2829,6 +2938,7 @@
           <w:p>
             <w:pPr>
               <w:spacing w:line="252" w:lineRule="auto" w:after="80" w:before="80"/>
+              <w:jc w:val="left"/>
             </w:pPr>
             <w:r>
               <w:rPr>
@@ -2851,6 +2961,7 @@
           <w:p>
             <w:pPr>
               <w:spacing w:line="252" w:lineRule="auto" w:after="80" w:before="80"/>
+              <w:jc w:val="left"/>
             </w:pPr>
             <w:r>
               <w:rPr>
@@ -2868,6 +2979,7 @@
           <w:p>
             <w:pPr>
               <w:spacing w:line="252" w:lineRule="auto" w:after="80" w:before="80"/>
+              <w:jc w:val="left"/>
             </w:pPr>
             <w:r>
               <w:rPr>
@@ -2890,6 +3002,7 @@
           <w:p>
             <w:pPr>
               <w:spacing w:line="252" w:lineRule="auto" w:after="80" w:before="80"/>
+              <w:jc w:val="left"/>
             </w:pPr>
             <w:r>
               <w:rPr>
@@ -2907,6 +3020,7 @@
           <w:p>
             <w:pPr>
               <w:spacing w:line="252" w:lineRule="auto" w:after="80" w:before="80"/>
+              <w:jc w:val="left"/>
             </w:pPr>
             <w:r>
               <w:rPr>
@@ -2929,6 +3043,7 @@
           <w:p>
             <w:pPr>
               <w:spacing w:line="252" w:lineRule="auto" w:after="80" w:before="80"/>
+              <w:jc w:val="left"/>
             </w:pPr>
             <w:r>
               <w:rPr>
@@ -2946,6 +3061,7 @@
           <w:p>
             <w:pPr>
               <w:spacing w:line="252" w:lineRule="auto" w:after="80" w:before="80"/>
+              <w:jc w:val="left"/>
             </w:pPr>
             <w:r>
               <w:rPr>
@@ -3047,9 +3163,9 @@
         <w:tblLook w:firstColumn="1" w:firstRow="1" w:lastColumn="0" w:lastRow="0" w:noHBand="0" w:noVBand="1" w:val="04A0"/>
       </w:tblPr>
       <w:tblGrid>
-        <w:gridCol w:w="3118"/>
-        <w:gridCol w:w="3118"/>
-        <w:gridCol w:w="3118"/>
+        <w:gridCol w:w="2995"/>
+        <w:gridCol w:w="2995"/>
+        <w:gridCol w:w="3010"/>
       </w:tblGrid>
       <w:tr>
         <w:trPr>
@@ -3063,6 +3179,7 @@
           <w:p>
             <w:pPr>
               <w:spacing w:line="252" w:lineRule="auto" w:after="80" w:before="80"/>
+              <w:jc w:val="left"/>
             </w:pPr>
             <w:r>
               <w:rPr>
@@ -3081,6 +3198,7 @@
           <w:p>
             <w:pPr>
               <w:spacing w:line="252" w:lineRule="auto" w:after="80" w:before="80"/>
+              <w:jc w:val="left"/>
             </w:pPr>
             <w:r>
               <w:rPr>
@@ -3099,6 +3217,7 @@
           <w:p>
             <w:pPr>
               <w:spacing w:line="252" w:lineRule="auto" w:after="80" w:before="80"/>
+              <w:jc w:val="left"/>
             </w:pPr>
             <w:r>
               <w:rPr>
@@ -3121,6 +3240,7 @@
           <w:p>
             <w:pPr>
               <w:spacing w:line="252" w:lineRule="auto" w:after="80" w:before="80"/>
+              <w:jc w:val="left"/>
             </w:pPr>
             <w:r>
               <w:rPr>
@@ -3138,6 +3258,7 @@
           <w:p>
             <w:pPr>
               <w:spacing w:line="252" w:lineRule="auto" w:after="80" w:before="80"/>
+              <w:jc w:val="left"/>
             </w:pPr>
             <w:r>
               <w:rPr>
@@ -3155,6 +3276,7 @@
           <w:p>
             <w:pPr>
               <w:spacing w:line="252" w:lineRule="auto" w:after="80" w:before="80"/>
+              <w:jc w:val="left"/>
             </w:pPr>
             <w:r>
               <w:rPr>
@@ -3194,8 +3316,8 @@
         <w:tblLook w:firstColumn="1" w:firstRow="1" w:lastColumn="0" w:lastRow="0" w:noHBand="0" w:noVBand="1" w:val="04A0"/>
       </w:tblPr>
       <w:tblGrid>
-        <w:gridCol w:w="4677"/>
-        <w:gridCol w:w="4677"/>
+        <w:gridCol w:w="2880"/>
+        <w:gridCol w:w="6120"/>
       </w:tblGrid>
       <w:tr>
         <w:trPr>
@@ -3209,6 +3331,7 @@
           <w:p>
             <w:pPr>
               <w:spacing w:line="252" w:lineRule="auto" w:after="80" w:before="80"/>
+              <w:jc w:val="left"/>
             </w:pPr>
             <w:r>
               <w:rPr>
@@ -3227,6 +3350,7 @@
           <w:p>
             <w:pPr>
               <w:spacing w:line="252" w:lineRule="auto" w:after="80" w:before="80"/>
+              <w:jc w:val="left"/>
             </w:pPr>
             <w:r>
               <w:rPr>
@@ -3249,6 +3373,7 @@
           <w:p>
             <w:pPr>
               <w:spacing w:line="252" w:lineRule="auto" w:after="80" w:before="80"/>
+              <w:jc w:val="left"/>
             </w:pPr>
             <w:r>
               <w:rPr>
@@ -3266,6 +3391,7 @@
           <w:p>
             <w:pPr>
               <w:spacing w:line="252" w:lineRule="auto" w:after="80" w:before="80"/>
+              <w:jc w:val="left"/>
             </w:pPr>
             <w:r>
               <w:rPr>
@@ -3288,6 +3414,7 @@
           <w:p>
             <w:pPr>
               <w:spacing w:line="252" w:lineRule="auto" w:after="80" w:before="80"/>
+              <w:jc w:val="left"/>
             </w:pPr>
             <w:r>
               <w:rPr>
@@ -3305,6 +3432,7 @@
           <w:p>
             <w:pPr>
               <w:spacing w:line="252" w:lineRule="auto" w:after="80" w:before="80"/>
+              <w:jc w:val="left"/>
             </w:pPr>
             <w:r>
               <w:rPr>
@@ -3379,9 +3507,9 @@
         <w:tblLook w:firstColumn="1" w:firstRow="1" w:lastColumn="0" w:lastRow="0" w:noHBand="0" w:noVBand="1" w:val="04A0"/>
       </w:tblPr>
       <w:tblGrid>
-        <w:gridCol w:w="3118"/>
-        <w:gridCol w:w="3118"/>
-        <w:gridCol w:w="3118"/>
+        <w:gridCol w:w="4392"/>
+        <w:gridCol w:w="2304"/>
+        <w:gridCol w:w="2304"/>
       </w:tblGrid>
       <w:tr>
         <w:trPr>
@@ -3395,6 +3523,7 @@
           <w:p>
             <w:pPr>
               <w:spacing w:line="252" w:lineRule="auto" w:after="80" w:before="80"/>
+              <w:jc w:val="left"/>
             </w:pPr>
             <w:r>
               <w:rPr>
@@ -3413,6 +3542,7 @@
           <w:p>
             <w:pPr>
               <w:spacing w:line="252" w:lineRule="auto" w:after="80" w:before="80"/>
+              <w:jc w:val="left"/>
             </w:pPr>
             <w:r>
               <w:rPr>
@@ -3431,6 +3561,7 @@
           <w:p>
             <w:pPr>
               <w:spacing w:line="252" w:lineRule="auto" w:after="80" w:before="80"/>
+              <w:jc w:val="left"/>
             </w:pPr>
             <w:r>
               <w:rPr>
@@ -3453,6 +3584,7 @@
           <w:p>
             <w:pPr>
               <w:spacing w:line="252" w:lineRule="auto" w:after="80" w:before="80"/>
+              <w:jc w:val="left"/>
             </w:pPr>
             <w:r>
               <w:rPr>
@@ -3470,6 +3602,7 @@
           <w:p>
             <w:pPr>
               <w:spacing w:line="252" w:lineRule="auto" w:after="80" w:before="80"/>
+              <w:jc w:val="left"/>
             </w:pPr>
             <w:r>
               <w:rPr>
@@ -3487,6 +3620,7 @@
           <w:p>
             <w:pPr>
               <w:spacing w:line="252" w:lineRule="auto" w:after="80" w:before="80"/>
+              <w:jc w:val="left"/>
             </w:pPr>
             <w:r>
               <w:rPr>
@@ -3509,6 +3643,7 @@
           <w:p>
             <w:pPr>
               <w:spacing w:line="252" w:lineRule="auto" w:after="80" w:before="80"/>
+              <w:jc w:val="left"/>
             </w:pPr>
             <w:r>
               <w:rPr>
@@ -3526,6 +3661,7 @@
           <w:p>
             <w:pPr>
               <w:spacing w:line="252" w:lineRule="auto" w:after="80" w:before="80"/>
+              <w:jc w:val="left"/>
             </w:pPr>
             <w:r>
               <w:rPr>
@@ -3543,6 +3679,7 @@
           <w:p>
             <w:pPr>
               <w:spacing w:line="252" w:lineRule="auto" w:after="80" w:before="80"/>
+              <w:jc w:val="left"/>
             </w:pPr>
             <w:r>
               <w:rPr>
@@ -3611,9 +3748,9 @@
         <w:tblLook w:firstColumn="1" w:firstRow="1" w:lastColumn="0" w:lastRow="0" w:noHBand="0" w:noVBand="1" w:val="04A0"/>
       </w:tblPr>
       <w:tblGrid>
-        <w:gridCol w:w="3118"/>
-        <w:gridCol w:w="3118"/>
-        <w:gridCol w:w="3118"/>
+        <w:gridCol w:w="2952"/>
+        <w:gridCol w:w="3024"/>
+        <w:gridCol w:w="3024"/>
       </w:tblGrid>
       <w:tr>
         <w:trPr>
@@ -3627,6 +3764,7 @@
           <w:p>
             <w:pPr>
               <w:spacing w:line="252" w:lineRule="auto" w:after="80" w:before="80"/>
+              <w:jc w:val="left"/>
             </w:pPr>
             <w:r>
               <w:rPr>
@@ -3645,6 +3783,7 @@
           <w:p>
             <w:pPr>
               <w:spacing w:line="252" w:lineRule="auto" w:after="80" w:before="80"/>
+              <w:jc w:val="left"/>
             </w:pPr>
             <w:r>
               <w:rPr>
@@ -3663,6 +3802,7 @@
           <w:p>
             <w:pPr>
               <w:spacing w:line="252" w:lineRule="auto" w:after="80" w:before="80"/>
+              <w:jc w:val="left"/>
             </w:pPr>
             <w:r>
               <w:rPr>
@@ -3685,6 +3825,7 @@
           <w:p>
             <w:pPr>
               <w:spacing w:line="252" w:lineRule="auto" w:after="80" w:before="80"/>
+              <w:jc w:val="left"/>
             </w:pPr>
             <w:r>
               <w:rPr>
@@ -3702,6 +3843,7 @@
           <w:p>
             <w:pPr>
               <w:spacing w:line="252" w:lineRule="auto" w:after="80" w:before="80"/>
+              <w:jc w:val="left"/>
             </w:pPr>
             <w:r>
               <w:rPr>
@@ -3719,6 +3861,7 @@
           <w:p>
             <w:pPr>
               <w:spacing w:line="252" w:lineRule="auto" w:after="80" w:before="80"/>
+              <w:jc w:val="left"/>
             </w:pPr>
             <w:r>
               <w:rPr>
@@ -3741,6 +3884,7 @@
           <w:p>
             <w:pPr>
               <w:spacing w:line="252" w:lineRule="auto" w:after="80" w:before="80"/>
+              <w:jc w:val="left"/>
             </w:pPr>
             <w:r>
               <w:rPr>
@@ -3758,6 +3902,7 @@
           <w:p>
             <w:pPr>
               <w:spacing w:line="252" w:lineRule="auto" w:after="80" w:before="80"/>
+              <w:jc w:val="left"/>
             </w:pPr>
             <w:r>
               <w:rPr>
@@ -3775,6 +3920,7 @@
           <w:p>
             <w:pPr>
               <w:spacing w:line="252" w:lineRule="auto" w:after="80" w:before="80"/>
+              <w:jc w:val="left"/>
             </w:pPr>
             <w:r>
               <w:rPr>

</xml_diff>

<commit_message>
Embed supplied project screenshots in both assignment reports
</commit_message>
<xml_diff>
--- a/reports/Assignment_1_Track_B_Report.docx
+++ b/reports/Assignment_1_Track_B_Report.docx
@@ -784,7 +784,7 @@
                 <w:b w:val="0"/>
                 <w:sz w:val="24"/>
               </w:rPr>
-              <w:t>2. Environment and System Architecture</w:t>
+              <w:t>2. Environment and Architecture</w:t>
             </w:r>
           </w:p>
         </w:tc>
@@ -825,7 +825,7 @@
                 <w:b w:val="0"/>
                 <w:sz w:val="24"/>
               </w:rPr>
-              <w:t>3. MongoDB Ingestion and Aggregation</w:t>
+              <w:t>3. Cluster Verification</w:t>
             </w:r>
           </w:p>
         </w:tc>
@@ -866,7 +866,7 @@
                 <w:b w:val="0"/>
                 <w:sz w:val="24"/>
               </w:rPr>
-              <w:t>4. MongoDB Profiling and Analytical Results</w:t>
+              <w:t>4. MongoDB Ingestion and Linkage</w:t>
             </w:r>
           </w:p>
         </w:tc>
@@ -907,7 +907,7 @@
                 <w:b w:val="0"/>
                 <w:sz w:val="24"/>
               </w:rPr>
-              <w:t>5. HDFS File Management and MapReduce</w:t>
+              <w:t>5. MongoDB Aggregation and Profiling</w:t>
             </w:r>
           </w:p>
         </w:tc>
@@ -948,7 +948,7 @@
                 <w:b w:val="0"/>
                 <w:sz w:val="24"/>
               </w:rPr>
-              <w:t>6. Pig Transformation and Hive Tables</w:t>
+              <w:t>6. HDFS File Management</w:t>
             </w:r>
           </w:p>
         </w:tc>
@@ -989,7 +989,7 @@
                 <w:b w:val="0"/>
                 <w:sz w:val="24"/>
               </w:rPr>
-              <w:t>7. Hive Performance and Storage Results</w:t>
+              <w:t>7. MapReduce Analytics on YARN</w:t>
             </w:r>
           </w:p>
         </w:tc>
@@ -1030,7 +1030,7 @@
                 <w:b w:val="0"/>
                 <w:sz w:val="24"/>
               </w:rPr>
-              <w:t>8. Conclusion and References</w:t>
+              <w:t>8. Pig Transformation and Hive Tables</w:t>
             </w:r>
           </w:p>
         </w:tc>
@@ -1049,6 +1049,88 @@
                 <w:sz w:val="24"/>
               </w:rPr>
               <w:t>10</w:t>
+            </w:r>
+          </w:p>
+        </w:tc>
+      </w:tr>
+      <w:tr>
+        <w:trPr>
+          <w:cantSplit/>
+        </w:trPr>
+        <w:tc>
+          <w:tcPr>
+            <w:tcW w:type="dxa" w:w="7992"/>
+          </w:tcPr>
+          <w:p>
+            <w:pPr>
+              <w:spacing w:line="252" w:lineRule="auto" w:after="80" w:before="80"/>
+              <w:jc w:val="left"/>
+            </w:pPr>
+            <w:r>
+              <w:rPr>
+                <w:b w:val="0"/>
+                <w:sz w:val="24"/>
+              </w:rPr>
+              <w:t>9. Hive Performance and Storage Results</w:t>
+            </w:r>
+          </w:p>
+        </w:tc>
+        <w:tc>
+          <w:tcPr>
+            <w:tcW w:type="dxa" w:w="1152"/>
+          </w:tcPr>
+          <w:p>
+            <w:pPr>
+              <w:spacing w:line="252" w:lineRule="auto" w:after="80" w:before="80"/>
+              <w:jc w:val="left"/>
+            </w:pPr>
+            <w:r>
+              <w:rPr>
+                <w:b w:val="0"/>
+                <w:sz w:val="24"/>
+              </w:rPr>
+              <w:t>11</w:t>
+            </w:r>
+          </w:p>
+        </w:tc>
+      </w:tr>
+      <w:tr>
+        <w:trPr>
+          <w:cantSplit/>
+        </w:trPr>
+        <w:tc>
+          <w:tcPr>
+            <w:tcW w:type="dxa" w:w="7992"/>
+          </w:tcPr>
+          <w:p>
+            <w:pPr>
+              <w:spacing w:line="252" w:lineRule="auto" w:after="80" w:before="80"/>
+              <w:jc w:val="left"/>
+            </w:pPr>
+            <w:r>
+              <w:rPr>
+                <w:b w:val="0"/>
+                <w:sz w:val="24"/>
+              </w:rPr>
+              <w:t>10. Conclusion and References</w:t>
+            </w:r>
+          </w:p>
+        </w:tc>
+        <w:tc>
+          <w:tcPr>
+            <w:tcW w:type="dxa" w:w="1152"/>
+          </w:tcPr>
+          <w:p>
+            <w:pPr>
+              <w:spacing w:line="252" w:lineRule="auto" w:after="80" w:before="80"/>
+              <w:jc w:val="left"/>
+            </w:pPr>
+            <w:r>
+              <w:rPr>
+                <w:b w:val="0"/>
+                <w:sz w:val="24"/>
+              </w:rPr>
+              <w:t>12</w:t>
             </w:r>
           </w:p>
         </w:tc>
@@ -1086,7 +1168,7 @@
         <w:rPr>
           <w:b w:val="0"/>
         </w:rPr>
-        <w:t>This project analyses the USDA FoodData Central October 2024 CSV package using document processing and distributed batch analytics. Food descriptions, nutrient definitions and nutrient amounts are linked through identifiers, transformed into line-oriented records and processed across MongoDB, Hadoop MapReduce, Pig and Hive.</w:t>
+        <w:t>This project analyses the USDA FoodData Central October 2024 CSV release using MongoDB, Hadoop MapReduce, Pig and Hive. Food descriptions, nutrient definitions and amounts are linked through identifiers and processed into food-type counts and nutrient summaries. The Flask dashboard presents the recorded evidence as the Track B practical extension.</w:t>
       </w:r>
     </w:p>
     <w:p>
@@ -1097,15 +1179,7 @@
         <w:rPr>
           <w:b w:val="0"/>
         </w:rPr>
-        <w:t>The objectives are to ingest and index source documents, calculate food and nutrient summaries, demonstrate distributed file operations, clean prepared records, and compare equivalent Hive queries over Text and RCFile storage. A Flask dashboard presents the recorded evidence as the Track B practical extension.</w:t>
-      </w:r>
-    </w:p>
-    <w:p>
-      <w:pPr>
-        <w:pStyle w:val="Heading2"/>
-      </w:pPr>
-      <w:r>
-        <w:t>1.1 Dataset scope</w:t>
+        <w:t>The objectives are to ingest and index documents, execute aggregation pipelines, demonstrate distributed file operations and MapReduce, transform prepared data using Pig, and compare identical Hive queries over Text and RCFile storage.</w:t>
       </w:r>
     </w:p>
     <w:tbl>
@@ -1139,7 +1213,7 @@
                 <w:b/>
                 <w:sz w:val="24"/>
               </w:rPr>
-              <w:t>Item</w:t>
+              <w:t>Dataset item</w:t>
             </w:r>
           </w:p>
         </w:tc>
@@ -1200,7 +1274,7 @@
                 <w:b w:val="0"/>
                 <w:sz w:val="24"/>
               </w:rPr>
-              <w:t>Food records</w:t>
+              <w:t>Foods</w:t>
             </w:r>
           </w:p>
         </w:tc>
@@ -1259,7 +1333,7 @@
                 <w:b w:val="0"/>
                 <w:sz w:val="24"/>
               </w:rPr>
-              <w:t>Food–nutrient records</w:t>
+              <w:t>Food–nutrient observations</w:t>
             </w:r>
           </w:p>
         </w:tc>
@@ -1377,7 +1451,7 @@
                 <w:b w:val="0"/>
                 <w:sz w:val="24"/>
               </w:rPr>
-              <w:t>Source CSV tables</w:t>
+              <w:t>Source tables</w:t>
             </w:r>
           </w:p>
         </w:tc>
@@ -1395,7 +1469,7 @@
                 <w:b w:val="0"/>
                 <w:sz w:val="24"/>
               </w:rPr>
-              <w:t>34</w:t>
+              <w:t>34 CSV files</w:t>
             </w:r>
           </w:p>
         </w:tc>
@@ -1413,7 +1487,7 @@
                 <w:b w:val="0"/>
                 <w:sz w:val="24"/>
               </w:rPr>
-              <w:t>3 used for linked analytics</w:t>
+              <w:t>3 principal linked tables</w:t>
             </w:r>
           </w:p>
         </w:tc>
@@ -1421,21 +1495,10 @@
     </w:tbl>
     <w:p>
       <w:pPr>
-        <w:jc w:val="both"/>
-      </w:pPr>
-      <w:r>
-        <w:rPr>
-          <w:b w:val="0"/>
-        </w:rPr>
-        <w:t>The development subset selects the first 50,000 foods by source-row ordinal and includes all their linked nutrient records. It is a deterministic development selection, rather than a representative statistical sample. All 34 source CSV files were separately imported into the full-source MongoDB database.</w:t>
-      </w:r>
-    </w:p>
-    <w:p>
-      <w:pPr>
         <w:pStyle w:val="Heading2"/>
       </w:pPr>
       <w:r>
-        <w:t>1.2 Principal source tables</w:t>
+        <w:t>1.1 Selection and source relationships</w:t>
       </w:r>
     </w:p>
     <w:p>
@@ -1446,7 +1509,37 @@
         <w:rPr>
           <w:b w:val="0"/>
         </w:rPr>
-        <w:t>food.csv provides food identifiers, names and types; food_nutrient.csv links food identifiers to nutrient identifiers and amounts; nutrient.csv supplies nutrient names and units. The joins use fdc_id and nutrient_id. Prepared TSV records contain food ID, type, category, nutrient ID, nutrient name, unit and amount.</w:t>
+        <w:t>The development subset takes the first 50,000 foods by source-row ordinal and retains all their linked nutrient observations. It is a deterministic development selection, not a representative statistical sample. Full-source ingestion separately imported all 34 CSV tables into MongoDB.</w:t>
+      </w:r>
+    </w:p>
+    <w:p>
+      <w:pPr>
+        <w:jc w:val="both"/>
+      </w:pPr>
+      <w:r>
+        <w:rPr>
+          <w:b w:val="0"/>
+        </w:rPr>
+        <w:t>food.csv supplies food IDs, names and types; food_nutrient.csv connects food IDs to nutrient IDs and amounts; nutrient.csv supplies nutrient names and units. The joins use fdc_id and nutrient_id. Each prepared record contains food ID, type, category, nutrient ID, name, unit and amount.</w:t>
+      </w:r>
+    </w:p>
+    <w:p>
+      <w:pPr>
+        <w:pStyle w:val="Heading2"/>
+      </w:pPr>
+      <w:r>
+        <w:t>1.2 Interpretation</w:t>
+      </w:r>
+    </w:p>
+    <w:p>
+      <w:pPr>
+        <w:jc w:val="both"/>
+      </w:pPr>
+      <w:r>
+        <w:rPr>
+          <w:b w:val="0"/>
+        </w:rPr>
+        <w:t>A food can have many nutrient observations. A grouped mean is the total recorded amount divided by the number of usable observations for that nutrient and food type. It does not describe a single named product or an amount consumed.</w:t>
       </w:r>
     </w:p>
     <w:p>
@@ -1459,7 +1552,7 @@
         <w:pStyle w:val="Heading1"/>
       </w:pPr>
       <w:r>
-        <w:t>2. Environment and System Architecture</w:t>
+        <w:t>2. Environment and Architecture</w:t>
       </w:r>
     </w:p>
     <w:p>
@@ -1470,7 +1563,7 @@
         <w:rPr>
           <w:b w:val="0"/>
         </w:rPr>
-        <w:t>The reported experiment uses a three-container Hadoop cluster on one laptop: one master and two workers connected through a Docker network. The host runs Ubuntu 24.04 under Windows Subsystem for Linux 2, with approximately 10 GB allocated to WSL and four processors. This is a container development environment, distinct from three physical lab computers.</w:t>
+        <w:t>The reported experiment uses one master and two Hadoop worker containers connected through Docker on an Ubuntu 24.04 / WSL2 laptop. Approximately 10 GB RAM and four processors are available to WSL. This is a three-container development cluster, distinct from three physical lab computers.</w:t>
       </w:r>
     </w:p>
     <w:tbl>
@@ -1522,7 +1615,7 @@
                 <w:b/>
                 <w:sz w:val="24"/>
               </w:rPr>
-              <w:t>Project configuration</w:t>
+              <w:t>Configuration</w:t>
             </w:r>
           </w:p>
         </w:tc>
@@ -1545,7 +1638,7 @@
                 <w:b w:val="0"/>
                 <w:sz w:val="24"/>
               </w:rPr>
-              <w:t>Runtime</w:t>
+              <w:t>Hadoop / Java</w:t>
             </w:r>
           </w:p>
         </w:tc>
@@ -1563,7 +1656,7 @@
                 <w:b w:val="0"/>
                 <w:sz w:val="24"/>
               </w:rPr>
-              <w:t>Java 8; Hadoop 2.10.2; Python host / container runtimes</w:t>
+              <w:t>Hadoop 2.10.2; Java 8</w:t>
             </w:r>
           </w:p>
         </w:tc>
@@ -1586,7 +1679,7 @@
                 <w:b w:val="0"/>
                 <w:sz w:val="24"/>
               </w:rPr>
-              <w:t>Analytics</w:t>
+              <w:t>Analytics tools</w:t>
             </w:r>
           </w:p>
         </w:tc>
@@ -1645,7 +1738,7 @@
                 <w:b w:val="0"/>
                 <w:sz w:val="24"/>
               </w:rPr>
-              <w:t>HDFS NameNode and YARN ResourceManager; Pig/Hive clients</w:t>
+              <w:t>NameNode, ResourceManager and Pig/Hive clients</w:t>
             </w:r>
           </w:p>
         </w:tc>
@@ -1727,7 +1820,7 @@
                 <w:b w:val="0"/>
                 <w:sz w:val="24"/>
               </w:rPr>
-              <w:t>HDFS replication factor 2; persistent project directories</w:t>
+              <w:t>Persistent directories; HDFS replication factor 2</w:t>
             </w:r>
           </w:p>
         </w:tc>
@@ -1778,7 +1871,7 @@
         <w:jc w:val="center"/>
       </w:pPr>
       <w:r>
-        <w:t>Figure 1. FoodData Central processing branches and evidence flow.</w:t>
+        <w:t>Figure 1. Dataset processing branches and evidence flow.</w:t>
       </w:r>
     </w:p>
     <w:p>
@@ -1789,7 +1882,7 @@
         <w:rPr>
           <w:b w:val="0"/>
         </w:rPr>
-        <w:t>Cluster verification records two live DataNodes and two YARN workers. Prepared files are shared through HDFS; Python Streaming and Pig execute through YARN. MongoDB is run separately and switched with Hadoop during the laptop workflow to reduce concurrent memory demand.</w:t>
+        <w:t>MongoDB analytics and Hadoop analytics use the same selected records. MapReduce and Pig read prepared HDFS files as separate branches; Pig writes the cleaned input used by Hive. Service switching reduces concurrent memory use on the laptop.</w:t>
       </w:r>
     </w:p>
     <w:p>
@@ -1802,15 +1895,7 @@
         <w:pStyle w:val="Heading1"/>
       </w:pPr>
       <w:r>
-        <w:t>3. MongoDB Ingestion and Aggregation</w:t>
-      </w:r>
-    </w:p>
-    <w:p>
-      <w:pPr>
-        <w:pStyle w:val="Heading2"/>
-      </w:pPr>
-      <w:r>
-        <w:t>3.1 Collections and linkage</w:t>
+        <w:t>3. Cluster Verification</w:t>
       </w:r>
     </w:p>
     <w:p>
@@ -1821,7 +1906,105 @@
         <w:rPr>
           <w:b w:val="0"/>
         </w:rPr>
-        <w:t>The analysed subset uses raw_food, raw_food_nutrient and raw_nutrient as source collections. The derived foods collection stores each food with its linked nutrient array, while metadata records source identity, row counts, selection and completion status. The original records remain unchanged when analytical outputs are generated.</w:t>
+        <w:t>The supplied terminal evidence reports two live DataNodes, worker1 and worker2, with normal decommission status. These are Docker network addresses. The capacity shown by each container reflects its underlying filesystem and should not be added as independent physical disk capacity.</w:t>
+      </w:r>
+    </w:p>
+    <w:p>
+      <w:pPr>
+        <w:spacing w:after="60"/>
+        <w:jc w:val="center"/>
+      </w:pPr>
+      <w:r>
+        <w:drawing>
+          <wp:inline xmlns:a="http://schemas.openxmlformats.org/drawingml/2006/main" xmlns:pic="http://schemas.openxmlformats.org/drawingml/2006/picture">
+            <wp:extent cx="5212080" cy="2441880"/>
+            <wp:docPr id="4" name="Picture 4"/>
+            <wp:cNvGraphicFramePr>
+              <a:graphicFrameLocks noChangeAspect="1"/>
+            </wp:cNvGraphicFramePr>
+            <a:graphic>
+              <a:graphicData uri="http://schemas.openxmlformats.org/drawingml/2006/picture">
+                <pic:pic>
+                  <pic:nvPicPr>
+                    <pic:cNvPr id="0" name="Screenshot 2026-10-28 114300.png"/>
+                    <pic:cNvPicPr/>
+                  </pic:nvPicPr>
+                  <pic:blipFill>
+                    <a:blip r:embed="rId14"/>
+                    <a:stretch>
+                      <a:fillRect/>
+                    </a:stretch>
+                  </pic:blipFill>
+                  <pic:spPr>
+                    <a:xfrm>
+                      <a:off x="0" y="0"/>
+                      <a:ext cx="5212080" cy="2441880"/>
+                    </a:xfrm>
+                    <a:prstGeom prst="rect"/>
+                  </pic:spPr>
+                </pic:pic>
+              </a:graphicData>
+            </a:graphic>
+          </wp:inline>
+        </w:drawing>
+      </w:r>
+    </w:p>
+    <w:p>
+      <w:pPr>
+        <w:spacing w:line="240" w:lineRule="auto" w:after="140"/>
+        <w:jc w:val="center"/>
+      </w:pPr>
+      <w:r>
+        <w:t>Figure 2. HDFS report identifying two live DataNodes and worker2.</w:t>
+      </w:r>
+    </w:p>
+    <w:p>
+      <w:pPr>
+        <w:spacing w:after="60"/>
+        <w:jc w:val="center"/>
+      </w:pPr>
+      <w:r>
+        <w:drawing>
+          <wp:inline xmlns:a="http://schemas.openxmlformats.org/drawingml/2006/main" xmlns:pic="http://schemas.openxmlformats.org/drawingml/2006/picture">
+            <wp:extent cx="5212080" cy="2479470"/>
+            <wp:docPr id="5" name="Picture 5"/>
+            <wp:cNvGraphicFramePr>
+              <a:graphicFrameLocks noChangeAspect="1"/>
+            </wp:cNvGraphicFramePr>
+            <a:graphic>
+              <a:graphicData uri="http://schemas.openxmlformats.org/drawingml/2006/picture">
+                <pic:pic>
+                  <pic:nvPicPr>
+                    <pic:cNvPr id="0" name="Screenshot 2026-10-28 114311.png"/>
+                    <pic:cNvPicPr/>
+                  </pic:nvPicPr>
+                  <pic:blipFill>
+                    <a:blip r:embed="rId15"/>
+                    <a:stretch>
+                      <a:fillRect/>
+                    </a:stretch>
+                  </pic:blipFill>
+                  <pic:spPr>
+                    <a:xfrm>
+                      <a:off x="0" y="0"/>
+                      <a:ext cx="5212080" cy="2479470"/>
+                    </a:xfrm>
+                    <a:prstGeom prst="rect"/>
+                  </pic:spPr>
+                </pic:pic>
+              </a:graphicData>
+            </a:graphic>
+          </wp:inline>
+        </w:drawing>
+      </w:r>
+    </w:p>
+    <w:p>
+      <w:pPr>
+        <w:spacing w:line="240" w:lineRule="auto" w:after="140"/>
+        <w:jc w:val="center"/>
+      </w:pPr>
+      <w:r>
+        <w:t>Figure 3. Worker1 details and the YARN verification command.</w:t>
       </w:r>
     </w:p>
     <w:p>
@@ -1832,305 +2015,7 @@
         <w:rPr>
           <w:b w:val="0"/>
         </w:rPr>
-        <w:t>A source example is food ID 1105904, “WESSON Vegetable Oil 1 GAL”. Its linked observations include polyunsaturated fatty acids (53.33 G), cholesterol (0 MG) and energy (867 KCAL). These are individual recorded amounts; totals across groups are separate analytical results.</w:t>
-      </w:r>
-    </w:p>
-    <w:p>
-      <w:pPr>
-        <w:pStyle w:val="Heading2"/>
-      </w:pPr>
-      <w:r>
-        <w:t>3.2 Aggregation pipelines</w:t>
-      </w:r>
-    </w:p>
-    <w:tbl>
-      <w:tblPr>
-        <w:tblStyle w:val="TableGrid"/>
-        <w:tblW w:type="auto" w:w="0"/>
-        <w:tblLayout w:type="fixed"/>
-        <w:tblLook w:firstColumn="1" w:firstRow="1" w:lastColumn="0" w:lastRow="0" w:noHBand="0" w:noVBand="1" w:val="04A0"/>
-      </w:tblPr>
-      <w:tblGrid>
-        <w:gridCol w:w="1584"/>
-        <w:gridCol w:w="7416"/>
-      </w:tblGrid>
-      <w:tr>
-        <w:trPr>
-          <w:cantSplit/>
-        </w:trPr>
-        <w:tc>
-          <w:tcPr>
-            <w:tcW w:type="dxa" w:w="1584"/>
-            <w:shd w:fill="EAF2EF"/>
-          </w:tcPr>
-          <w:p>
-            <w:pPr>
-              <w:spacing w:line="252" w:lineRule="auto" w:after="80" w:before="80"/>
-              <w:jc w:val="left"/>
-            </w:pPr>
-            <w:r>
-              <w:rPr>
-                <w:b/>
-                <w:sz w:val="24"/>
-              </w:rPr>
-              <w:t>Operator</w:t>
-            </w:r>
-          </w:p>
-        </w:tc>
-        <w:tc>
-          <w:tcPr>
-            <w:tcW w:type="dxa" w:w="7416"/>
-            <w:shd w:fill="EAF2EF"/>
-          </w:tcPr>
-          <w:p>
-            <w:pPr>
-              <w:spacing w:line="252" w:lineRule="auto" w:after="80" w:before="80"/>
-              <w:jc w:val="left"/>
-            </w:pPr>
-            <w:r>
-              <w:rPr>
-                <w:b/>
-                <w:sz w:val="24"/>
-              </w:rPr>
-              <w:t>Role in this implementation</w:t>
-            </w:r>
-          </w:p>
-        </w:tc>
-      </w:tr>
-      <w:tr>
-        <w:trPr>
-          <w:cantSplit/>
-        </w:trPr>
-        <w:tc>
-          <w:tcPr>
-            <w:tcW w:type="dxa" w:w="1584"/>
-          </w:tcPr>
-          <w:p>
-            <w:pPr>
-              <w:spacing w:line="252" w:lineRule="auto" w:after="80" w:before="80"/>
-              <w:jc w:val="left"/>
-            </w:pPr>
-            <w:r>
-              <w:rPr>
-                <w:b w:val="0"/>
-                <w:sz w:val="24"/>
-              </w:rPr>
-              <w:t>$match</w:t>
-            </w:r>
-          </w:p>
-        </w:tc>
-        <w:tc>
-          <w:tcPr>
-            <w:tcW w:type="dxa" w:w="7416"/>
-          </w:tcPr>
-          <w:p>
-            <w:pPr>
-              <w:spacing w:line="252" w:lineRule="auto" w:after="80" w:before="80"/>
-              <w:jc w:val="left"/>
-            </w:pPr>
-            <w:r>
-              <w:rPr>
-                <w:b w:val="0"/>
-                <w:sz w:val="24"/>
-              </w:rPr>
-              <w:t>Select valid amounts and restrict groups or records.</w:t>
-            </w:r>
-          </w:p>
-        </w:tc>
-      </w:tr>
-      <w:tr>
-        <w:trPr>
-          <w:cantSplit/>
-        </w:trPr>
-        <w:tc>
-          <w:tcPr>
-            <w:tcW w:type="dxa" w:w="1584"/>
-          </w:tcPr>
-          <w:p>
-            <w:pPr>
-              <w:spacing w:line="252" w:lineRule="auto" w:after="80" w:before="80"/>
-              <w:jc w:val="left"/>
-            </w:pPr>
-            <w:r>
-              <w:rPr>
-                <w:b w:val="0"/>
-                <w:sz w:val="24"/>
-              </w:rPr>
-              <w:t>$group</w:t>
-            </w:r>
-          </w:p>
-        </w:tc>
-        <w:tc>
-          <w:tcPr>
-            <w:tcW w:type="dxa" w:w="7416"/>
-          </w:tcPr>
-          <w:p>
-            <w:pPr>
-              <w:spacing w:line="252" w:lineRule="auto" w:after="80" w:before="80"/>
-              <w:jc w:val="left"/>
-            </w:pPr>
-            <w:r>
-              <w:rPr>
-                <w:b w:val="0"/>
-                <w:sz w:val="24"/>
-              </w:rPr>
-              <w:t>Calculate counts, sums and averages.</w:t>
-            </w:r>
-          </w:p>
-        </w:tc>
-      </w:tr>
-      <w:tr>
-        <w:trPr>
-          <w:cantSplit/>
-        </w:trPr>
-        <w:tc>
-          <w:tcPr>
-            <w:tcW w:type="dxa" w:w="1584"/>
-          </w:tcPr>
-          <w:p>
-            <w:pPr>
-              <w:spacing w:line="252" w:lineRule="auto" w:after="80" w:before="80"/>
-              <w:jc w:val="left"/>
-            </w:pPr>
-            <w:r>
-              <w:rPr>
-                <w:b w:val="0"/>
-                <w:sz w:val="24"/>
-              </w:rPr>
-              <w:t>$project</w:t>
-            </w:r>
-          </w:p>
-        </w:tc>
-        <w:tc>
-          <w:tcPr>
-            <w:tcW w:type="dxa" w:w="7416"/>
-          </w:tcPr>
-          <w:p>
-            <w:pPr>
-              <w:spacing w:line="252" w:lineRule="auto" w:after="80" w:before="80"/>
-              <w:jc w:val="left"/>
-            </w:pPr>
-            <w:r>
-              <w:rPr>
-                <w:b w:val="0"/>
-                <w:sz w:val="24"/>
-              </w:rPr>
-              <w:t>Choose fields and present calculated answers.</w:t>
-            </w:r>
-          </w:p>
-        </w:tc>
-      </w:tr>
-      <w:tr>
-        <w:trPr>
-          <w:cantSplit/>
-        </w:trPr>
-        <w:tc>
-          <w:tcPr>
-            <w:tcW w:type="dxa" w:w="1584"/>
-          </w:tcPr>
-          <w:p>
-            <w:pPr>
-              <w:spacing w:line="252" w:lineRule="auto" w:after="80" w:before="80"/>
-              <w:jc w:val="left"/>
-            </w:pPr>
-            <w:r>
-              <w:rPr>
-                <w:b w:val="0"/>
-                <w:sz w:val="24"/>
-              </w:rPr>
-              <w:t>$unwind</w:t>
-            </w:r>
-          </w:p>
-        </w:tc>
-        <w:tc>
-          <w:tcPr>
-            <w:tcW w:type="dxa" w:w="7416"/>
-          </w:tcPr>
-          <w:p>
-            <w:pPr>
-              <w:spacing w:line="252" w:lineRule="auto" w:after="80" w:before="80"/>
-              <w:jc w:val="left"/>
-            </w:pPr>
-            <w:r>
-              <w:rPr>
-                <w:b w:val="0"/>
-                <w:sz w:val="24"/>
-              </w:rPr>
-              <w:t>Expand the linked nutrient array into observations.</w:t>
-            </w:r>
-          </w:p>
-        </w:tc>
-      </w:tr>
-      <w:tr>
-        <w:trPr>
-          <w:cantSplit/>
-        </w:trPr>
-        <w:tc>
-          <w:tcPr>
-            <w:tcW w:type="dxa" w:w="1584"/>
-          </w:tcPr>
-          <w:p>
-            <w:pPr>
-              <w:spacing w:line="252" w:lineRule="auto" w:after="80" w:before="80"/>
-              <w:jc w:val="left"/>
-            </w:pPr>
-            <w:r>
-              <w:rPr>
-                <w:b w:val="0"/>
-                <w:sz w:val="24"/>
-              </w:rPr>
-              <w:t>$facet</w:t>
-            </w:r>
-          </w:p>
-        </w:tc>
-        <w:tc>
-          <w:tcPr>
-            <w:tcW w:type="dxa" w:w="7416"/>
-          </w:tcPr>
-          <w:p>
-            <w:pPr>
-              <w:spacing w:line="252" w:lineRule="auto" w:after="80" w:before="80"/>
-              <w:jc w:val="left"/>
-            </w:pPr>
-            <w:r>
-              <w:rPr>
-                <w:b w:val="0"/>
-                <w:sz w:val="24"/>
-              </w:rPr>
-              <w:t>Produce food count, type distribution and nutrient coverage together.</w:t>
-            </w:r>
-          </w:p>
-        </w:tc>
-      </w:tr>
-    </w:tbl>
-    <w:p>
-      <w:pPr>
-        <w:jc w:val="both"/>
-      </w:pPr>
-      <w:r>
-        <w:rPr>
-          <w:b w:val="0"/>
-        </w:rPr>
-        <w:t>The foods_by_type pipeline counts foods by data type. The nutrient_summary pipeline expands nutrient arrays and groups observations by food type and nutrient identifier. The overview pipeline combines multiple summaries in one faceted result. The displayed examples are limited previews, not limits on the actual analysis.</w:t>
-      </w:r>
-    </w:p>
-    <w:p>
-      <w:pPr>
-        <w:pStyle w:val="Heading2"/>
-      </w:pPr>
-      <w:r>
-        <w:t>3.3 Indexes</w:t>
-      </w:r>
-    </w:p>
-    <w:p>
-      <w:pPr>
-        <w:jc w:val="both"/>
-      </w:pPr>
-      <w:r>
-        <w:rPr>
-          <w:b w:val="0"/>
-        </w:rPr>
-        <w:t>Indexes on raw_food.fdc_id, raw_food_nutrient.fdc_id and raw_nutrient.id support food lookups and the food–nutrient joins. The profiling experiment forces an unindexed collection scan and an indexed lookup for the same food identifier.</w:t>
+        <w:t>These captures document a cluster verification session. The selected analytical run separately records two DataNodes and two YARN workers in its dashboard evidence. A sample Pi job is used to verify MapReduce execution before the food analytics job; Pi is not a nutritional result.</w:t>
       </w:r>
     </w:p>
     <w:p>
@@ -2143,7 +2028,7 @@
         <w:pStyle w:val="Heading1"/>
       </w:pPr>
       <w:r>
-        <w:t>4. MongoDB Profiling and Analytical Results</w:t>
+        <w:t>4. MongoDB Ingestion and Linkage</w:t>
       </w:r>
     </w:p>
     <w:p>
@@ -2154,610 +2039,56 @@
         <w:rPr>
           <w:b w:val="0"/>
         </w:rPr>
-        <w:t>The same lookup was executed five times per plan in alternating order. The supplied 50,000-food dashboard evidence reports the following median execution statistics.</w:t>
-      </w:r>
-    </w:p>
-    <w:tbl>
-      <w:tblPr>
-        <w:tblStyle w:val="TableGrid"/>
-        <w:tblW w:type="auto" w:w="0"/>
-        <w:tblLayout w:type="fixed"/>
-        <w:tblLook w:firstColumn="1" w:firstRow="1" w:lastColumn="0" w:lastRow="0" w:noHBand="0" w:noVBand="1" w:val="04A0"/>
-      </w:tblPr>
-      <w:tblGrid>
-        <w:gridCol w:w="2376"/>
-        <w:gridCol w:w="1800"/>
-        <w:gridCol w:w="1584"/>
-        <w:gridCol w:w="1440"/>
-        <w:gridCol w:w="1800"/>
-      </w:tblGrid>
-      <w:tr>
-        <w:trPr>
-          <w:cantSplit/>
-        </w:trPr>
-        <w:tc>
-          <w:tcPr>
-            <w:tcW w:type="dxa" w:w="2376"/>
-            <w:shd w:fill="EAF2EF"/>
-          </w:tcPr>
-          <w:p>
-            <w:pPr>
-              <w:spacing w:line="252" w:lineRule="auto" w:after="80" w:before="80"/>
-              <w:jc w:val="left"/>
-            </w:pPr>
-            <w:r>
-              <w:rPr>
-                <w:b/>
-                <w:sz w:val="24"/>
-              </w:rPr>
-              <w:t>Plan</w:t>
-            </w:r>
-          </w:p>
-        </w:tc>
-        <w:tc>
-          <w:tcPr>
-            <w:tcW w:type="dxa" w:w="1800"/>
-            <w:shd w:fill="EAF2EF"/>
-          </w:tcPr>
-          <w:p>
-            <w:pPr>
-              <w:spacing w:line="252" w:lineRule="auto" w:after="80" w:before="80"/>
-              <w:jc w:val="left"/>
-            </w:pPr>
-            <w:r>
-              <w:rPr>
-                <w:b/>
-                <w:sz w:val="24"/>
-              </w:rPr>
-              <w:t>Docs checked</w:t>
-            </w:r>
-          </w:p>
-        </w:tc>
-        <w:tc>
-          <w:tcPr>
-            <w:tcW w:type="dxa" w:w="1584"/>
-            <w:shd w:fill="EAF2EF"/>
-          </w:tcPr>
-          <w:p>
-            <w:pPr>
-              <w:spacing w:line="252" w:lineRule="auto" w:after="80" w:before="80"/>
-              <w:jc w:val="left"/>
-            </w:pPr>
-            <w:r>
-              <w:rPr>
-                <w:b/>
-                <w:sz w:val="24"/>
-              </w:rPr>
-              <w:t>Index keys</w:t>
-            </w:r>
-          </w:p>
-        </w:tc>
-        <w:tc>
-          <w:tcPr>
-            <w:tcW w:type="dxa" w:w="1440"/>
-            <w:shd w:fill="EAF2EF"/>
-          </w:tcPr>
-          <w:p>
-            <w:pPr>
-              <w:spacing w:line="252" w:lineRule="auto" w:after="80" w:before="80"/>
-              <w:jc w:val="left"/>
-            </w:pPr>
-            <w:r>
-              <w:rPr>
-                <w:b/>
-                <w:sz w:val="24"/>
-              </w:rPr>
-              <w:t>Returned</w:t>
-            </w:r>
-          </w:p>
-        </w:tc>
-        <w:tc>
-          <w:tcPr>
-            <w:tcW w:type="dxa" w:w="1800"/>
-            <w:shd w:fill="EAF2EF"/>
-          </w:tcPr>
-          <w:p>
-            <w:pPr>
-              <w:spacing w:line="252" w:lineRule="auto" w:after="80" w:before="80"/>
-              <w:jc w:val="left"/>
-            </w:pPr>
-            <w:r>
-              <w:rPr>
-                <w:b/>
-                <w:sz w:val="24"/>
-              </w:rPr>
-              <w:t>Median ms</w:t>
-            </w:r>
-          </w:p>
-        </w:tc>
-      </w:tr>
-      <w:tr>
-        <w:trPr>
-          <w:cantSplit/>
-        </w:trPr>
-        <w:tc>
-          <w:tcPr>
-            <w:tcW w:type="dxa" w:w="2376"/>
-          </w:tcPr>
-          <w:p>
-            <w:pPr>
-              <w:spacing w:line="252" w:lineRule="auto" w:after="80" w:before="80"/>
-              <w:jc w:val="left"/>
-            </w:pPr>
-            <w:r>
-              <w:rPr>
-                <w:b w:val="0"/>
-                <w:sz w:val="24"/>
-              </w:rPr>
-              <w:t>Collection scan</w:t>
-            </w:r>
-          </w:p>
-        </w:tc>
-        <w:tc>
-          <w:tcPr>
-            <w:tcW w:type="dxa" w:w="1800"/>
-          </w:tcPr>
-          <w:p>
-            <w:pPr>
-              <w:spacing w:line="252" w:lineRule="auto" w:after="80" w:before="80"/>
-              <w:jc w:val="left"/>
-            </w:pPr>
-            <w:r>
-              <w:rPr>
-                <w:b w:val="0"/>
-                <w:sz w:val="24"/>
-              </w:rPr>
-              <w:t>50,000</w:t>
-            </w:r>
-          </w:p>
-        </w:tc>
-        <w:tc>
-          <w:tcPr>
-            <w:tcW w:type="dxa" w:w="1584"/>
-          </w:tcPr>
-          <w:p>
-            <w:pPr>
-              <w:spacing w:line="252" w:lineRule="auto" w:after="80" w:before="80"/>
-              <w:jc w:val="left"/>
-            </w:pPr>
-            <w:r>
-              <w:rPr>
-                <w:b w:val="0"/>
-                <w:sz w:val="24"/>
-              </w:rPr>
-              <w:t>0</w:t>
-            </w:r>
-          </w:p>
-        </w:tc>
-        <w:tc>
-          <w:tcPr>
-            <w:tcW w:type="dxa" w:w="1440"/>
-          </w:tcPr>
-          <w:p>
-            <w:pPr>
-              <w:spacing w:line="252" w:lineRule="auto" w:after="80" w:before="80"/>
-              <w:jc w:val="left"/>
-            </w:pPr>
-            <w:r>
-              <w:rPr>
-                <w:b w:val="0"/>
-                <w:sz w:val="24"/>
-              </w:rPr>
-              <w:t>1</w:t>
-            </w:r>
-          </w:p>
-        </w:tc>
-        <w:tc>
-          <w:tcPr>
-            <w:tcW w:type="dxa" w:w="1800"/>
-          </w:tcPr>
-          <w:p>
-            <w:pPr>
-              <w:spacing w:line="252" w:lineRule="auto" w:after="80" w:before="80"/>
-              <w:jc w:val="left"/>
-            </w:pPr>
-            <w:r>
-              <w:rPr>
-                <w:b w:val="0"/>
-                <w:sz w:val="24"/>
-              </w:rPr>
-              <w:t>42</w:t>
-            </w:r>
-          </w:p>
-        </w:tc>
-      </w:tr>
-      <w:tr>
-        <w:trPr>
-          <w:cantSplit/>
-        </w:trPr>
-        <w:tc>
-          <w:tcPr>
-            <w:tcW w:type="dxa" w:w="2376"/>
-          </w:tcPr>
-          <w:p>
-            <w:pPr>
-              <w:spacing w:line="252" w:lineRule="auto" w:after="80" w:before="80"/>
-              <w:jc w:val="left"/>
-            </w:pPr>
-            <w:r>
-              <w:rPr>
-                <w:b w:val="0"/>
-                <w:sz w:val="24"/>
-              </w:rPr>
-              <w:t>Indexed lookup</w:t>
-            </w:r>
-          </w:p>
-        </w:tc>
-        <w:tc>
-          <w:tcPr>
-            <w:tcW w:type="dxa" w:w="1800"/>
-          </w:tcPr>
-          <w:p>
-            <w:pPr>
-              <w:spacing w:line="252" w:lineRule="auto" w:after="80" w:before="80"/>
-              <w:jc w:val="left"/>
-            </w:pPr>
-            <w:r>
-              <w:rPr>
-                <w:b w:val="0"/>
-                <w:sz w:val="24"/>
-              </w:rPr>
-              <w:t>1</w:t>
-            </w:r>
-          </w:p>
-        </w:tc>
-        <w:tc>
-          <w:tcPr>
-            <w:tcW w:type="dxa" w:w="1584"/>
-          </w:tcPr>
-          <w:p>
-            <w:pPr>
-              <w:spacing w:line="252" w:lineRule="auto" w:after="80" w:before="80"/>
-              <w:jc w:val="left"/>
-            </w:pPr>
-            <w:r>
-              <w:rPr>
-                <w:b w:val="0"/>
-                <w:sz w:val="24"/>
-              </w:rPr>
-              <w:t>1</w:t>
-            </w:r>
-          </w:p>
-        </w:tc>
-        <w:tc>
-          <w:tcPr>
-            <w:tcW w:type="dxa" w:w="1440"/>
-          </w:tcPr>
-          <w:p>
-            <w:pPr>
-              <w:spacing w:line="252" w:lineRule="auto" w:after="80" w:before="80"/>
-              <w:jc w:val="left"/>
-            </w:pPr>
-            <w:r>
-              <w:rPr>
-                <w:b w:val="0"/>
-                <w:sz w:val="24"/>
-              </w:rPr>
-              <w:t>1</w:t>
-            </w:r>
-          </w:p>
-        </w:tc>
-        <w:tc>
-          <w:tcPr>
-            <w:tcW w:type="dxa" w:w="1800"/>
-          </w:tcPr>
-          <w:p>
-            <w:pPr>
-              <w:spacing w:line="252" w:lineRule="auto" w:after="80" w:before="80"/>
-              <w:jc w:val="left"/>
-            </w:pPr>
-            <w:r>
-              <w:rPr>
-                <w:b w:val="0"/>
-                <w:sz w:val="24"/>
-              </w:rPr>
-              <w:t>0</w:t>
-            </w:r>
-          </w:p>
-        </w:tc>
-      </w:tr>
-    </w:tbl>
-    <w:p>
-      <w:pPr>
-        <w:jc w:val="both"/>
-      </w:pPr>
-      <w:r>
-        <w:rPr>
-          <w:b w:val="0"/>
-        </w:rPr>
-        <w:t>Both plans return one matching food. The index reduces documents examined from 50,000 to one. The displayed zero milliseconds is below the server timer’s millisecond resolution; it does not mean the lookup required no work. A finite speedup ratio is therefore not calculated from this zero value.</w:t>
+        <w:t>The subset uses raw_food, raw_food_nutrient and raw_nutrient as source collections. The derived foods collection links each food to an array of nutrient observations. The metadata collection records source identity, row counts, subset selection and import completion.</w:t>
       </w:r>
     </w:p>
     <w:p>
       <w:pPr>
-        <w:pStyle w:val="Heading2"/>
+        <w:spacing w:after="60"/>
+        <w:jc w:val="center"/>
       </w:pPr>
       <w:r>
-        <w:t>4.1 Selected food-type counts</w:t>
-      </w:r>
-    </w:p>
-    <w:tbl>
-      <w:tblPr>
-        <w:tblStyle w:val="TableGrid"/>
-        <w:tblW w:type="auto" w:w="0"/>
-        <w:tblLayout w:type="fixed"/>
-        <w:tblLook w:firstColumn="1" w:firstRow="1" w:lastColumn="0" w:lastRow="0" w:noHBand="0" w:noVBand="1" w:val="04A0"/>
-      </w:tblPr>
-      <w:tblGrid>
-        <w:gridCol w:w="6624"/>
-        <w:gridCol w:w="2376"/>
-      </w:tblGrid>
-      <w:tr>
-        <w:trPr>
-          <w:cantSplit/>
-        </w:trPr>
-        <w:tc>
-          <w:tcPr>
-            <w:tcW w:type="dxa" w:w="6624"/>
-            <w:shd w:fill="EAF2EF"/>
-          </w:tcPr>
-          <w:p>
-            <w:pPr>
-              <w:spacing w:line="252" w:lineRule="auto" w:after="80" w:before="80"/>
-              <w:jc w:val="left"/>
-            </w:pPr>
-            <w:r>
-              <w:rPr>
-                <w:b/>
-                <w:sz w:val="24"/>
-              </w:rPr>
-              <w:t>Food type</w:t>
-            </w:r>
-          </w:p>
-        </w:tc>
-        <w:tc>
-          <w:tcPr>
-            <w:tcW w:type="dxa" w:w="2376"/>
-            <w:shd w:fill="EAF2EF"/>
-          </w:tcPr>
-          <w:p>
-            <w:pPr>
-              <w:spacing w:line="252" w:lineRule="auto" w:after="80" w:before="80"/>
-              <w:jc w:val="left"/>
-            </w:pPr>
-            <w:r>
-              <w:rPr>
-                <w:b/>
-                <w:sz w:val="24"/>
-              </w:rPr>
-              <w:t>Foods</w:t>
-            </w:r>
-          </w:p>
-        </w:tc>
-      </w:tr>
-      <w:tr>
-        <w:trPr>
-          <w:cantSplit/>
-        </w:trPr>
-        <w:tc>
-          <w:tcPr>
-            <w:tcW w:type="dxa" w:w="6624"/>
-          </w:tcPr>
-          <w:p>
-            <w:pPr>
-              <w:spacing w:line="252" w:lineRule="auto" w:after="80" w:before="80"/>
-              <w:jc w:val="left"/>
-            </w:pPr>
-            <w:r>
-              <w:rPr>
-                <w:b w:val="0"/>
-                <w:sz w:val="24"/>
-              </w:rPr>
-              <w:t>branded_food</w:t>
-            </w:r>
-          </w:p>
-        </w:tc>
-        <w:tc>
-          <w:tcPr>
-            <w:tcW w:type="dxa" w:w="2376"/>
-          </w:tcPr>
-          <w:p>
-            <w:pPr>
-              <w:spacing w:line="252" w:lineRule="auto" w:after="80" w:before="80"/>
-              <w:jc w:val="left"/>
-            </w:pPr>
-            <w:r>
-              <w:rPr>
-                <w:b w:val="0"/>
-                <w:sz w:val="24"/>
-              </w:rPr>
-              <w:t>32,925</w:t>
-            </w:r>
-          </w:p>
-        </w:tc>
-      </w:tr>
-      <w:tr>
-        <w:trPr>
-          <w:cantSplit/>
-        </w:trPr>
-        <w:tc>
-          <w:tcPr>
-            <w:tcW w:type="dxa" w:w="6624"/>
-          </w:tcPr>
-          <w:p>
-            <w:pPr>
-              <w:spacing w:line="252" w:lineRule="auto" w:after="80" w:before="80"/>
-              <w:jc w:val="left"/>
-            </w:pPr>
-            <w:r>
-              <w:rPr>
-                <w:b w:val="0"/>
-                <w:sz w:val="24"/>
-              </w:rPr>
-              <w:t>sr_legacy_food</w:t>
-            </w:r>
-          </w:p>
-        </w:tc>
-        <w:tc>
-          <w:tcPr>
-            <w:tcW w:type="dxa" w:w="2376"/>
-          </w:tcPr>
-          <w:p>
-            <w:pPr>
-              <w:spacing w:line="252" w:lineRule="auto" w:after="80" w:before="80"/>
-              <w:jc w:val="left"/>
-            </w:pPr>
-            <w:r>
-              <w:rPr>
-                <w:b w:val="0"/>
-                <w:sz w:val="24"/>
-              </w:rPr>
-              <w:t>7,793</w:t>
-            </w:r>
-          </w:p>
-        </w:tc>
-      </w:tr>
-      <w:tr>
-        <w:trPr>
-          <w:cantSplit/>
-        </w:trPr>
-        <w:tc>
-          <w:tcPr>
-            <w:tcW w:type="dxa" w:w="6624"/>
-          </w:tcPr>
-          <w:p>
-            <w:pPr>
-              <w:spacing w:line="252" w:lineRule="auto" w:after="80" w:before="80"/>
-              <w:jc w:val="left"/>
-            </w:pPr>
-            <w:r>
-              <w:rPr>
-                <w:b w:val="0"/>
-                <w:sz w:val="24"/>
-              </w:rPr>
-              <w:t>sub_sample_food</w:t>
-            </w:r>
-          </w:p>
-        </w:tc>
-        <w:tc>
-          <w:tcPr>
-            <w:tcW w:type="dxa" w:w="2376"/>
-          </w:tcPr>
-          <w:p>
-            <w:pPr>
-              <w:spacing w:line="252" w:lineRule="auto" w:after="80" w:before="80"/>
-              <w:jc w:val="left"/>
-            </w:pPr>
-            <w:r>
-              <w:rPr>
-                <w:b w:val="0"/>
-                <w:sz w:val="24"/>
-              </w:rPr>
-              <w:t>5,967</w:t>
-            </w:r>
-          </w:p>
-        </w:tc>
-      </w:tr>
-      <w:tr>
-        <w:trPr>
-          <w:cantSplit/>
-        </w:trPr>
-        <w:tc>
-          <w:tcPr>
-            <w:tcW w:type="dxa" w:w="6624"/>
-          </w:tcPr>
-          <w:p>
-            <w:pPr>
-              <w:spacing w:line="252" w:lineRule="auto" w:after="80" w:before="80"/>
-              <w:jc w:val="left"/>
-            </w:pPr>
-            <w:r>
-              <w:rPr>
-                <w:b w:val="0"/>
-                <w:sz w:val="24"/>
-              </w:rPr>
-              <w:t>market_acquisition</w:t>
-            </w:r>
-          </w:p>
-        </w:tc>
-        <w:tc>
-          <w:tcPr>
-            <w:tcW w:type="dxa" w:w="2376"/>
-          </w:tcPr>
-          <w:p>
-            <w:pPr>
-              <w:spacing w:line="252" w:lineRule="auto" w:after="80" w:before="80"/>
-              <w:jc w:val="left"/>
-            </w:pPr>
-            <w:r>
-              <w:rPr>
-                <w:b w:val="0"/>
-                <w:sz w:val="24"/>
-              </w:rPr>
-              <w:t>2,506</w:t>
-            </w:r>
-          </w:p>
-        </w:tc>
-      </w:tr>
-      <w:tr>
-        <w:trPr>
-          <w:cantSplit/>
-        </w:trPr>
-        <w:tc>
-          <w:tcPr>
-            <w:tcW w:type="dxa" w:w="6624"/>
-          </w:tcPr>
-          <w:p>
-            <w:pPr>
-              <w:spacing w:line="252" w:lineRule="auto" w:after="80" w:before="80"/>
-              <w:jc w:val="left"/>
-            </w:pPr>
-            <w:r>
-              <w:rPr>
-                <w:b w:val="0"/>
-                <w:sz w:val="24"/>
-              </w:rPr>
-              <w:t>sample_food</w:t>
-            </w:r>
-          </w:p>
-        </w:tc>
-        <w:tc>
-          <w:tcPr>
-            <w:tcW w:type="dxa" w:w="2376"/>
-          </w:tcPr>
-          <w:p>
-            <w:pPr>
-              <w:spacing w:line="252" w:lineRule="auto" w:after="80" w:before="80"/>
-              <w:jc w:val="left"/>
-            </w:pPr>
-            <w:r>
-              <w:rPr>
-                <w:b w:val="0"/>
-                <w:sz w:val="24"/>
-              </w:rPr>
-              <w:t>756</w:t>
-            </w:r>
-          </w:p>
-        </w:tc>
-      </w:tr>
-    </w:tbl>
-    <w:p>
-      <w:pPr>
-        <w:jc w:val="both"/>
-      </w:pPr>
-      <w:r>
-        <w:rPr>
-          <w:b w:val="0"/>
-        </w:rPr>
-        <w:t>These are the five displayed groups, not the complete type distribution. The faceted overview confirms 50,000 foods and approximately 22.5 linked nutrient observations per food.</w:t>
+        <w:drawing>
+          <wp:inline xmlns:a="http://schemas.openxmlformats.org/drawingml/2006/main" xmlns:pic="http://schemas.openxmlformats.org/drawingml/2006/picture">
+            <wp:extent cx="5577840" cy="3574839"/>
+            <wp:docPr id="6" name="Picture 6"/>
+            <wp:cNvGraphicFramePr>
+              <a:graphicFrameLocks noChangeAspect="1"/>
+            </wp:cNvGraphicFramePr>
+            <a:graphic>
+              <a:graphicData uri="http://schemas.openxmlformats.org/drawingml/2006/picture">
+                <pic:pic>
+                  <pic:nvPicPr>
+                    <pic:cNvPr id="0" name="Screenshot 2026-10-28 114119.png"/>
+                    <pic:cNvPicPr/>
+                  </pic:nvPicPr>
+                  <pic:blipFill>
+                    <a:blip r:embed="rId16"/>
+                    <a:stretch>
+                      <a:fillRect/>
+                    </a:stretch>
+                  </pic:blipFill>
+                  <pic:spPr>
+                    <a:xfrm>
+                      <a:off x="0" y="0"/>
+                      <a:ext cx="5577840" cy="3574839"/>
+                    </a:xfrm>
+                    <a:prstGeom prst="rect"/>
+                  </pic:spPr>
+                </pic:pic>
+              </a:graphicData>
+            </a:graphic>
+          </wp:inline>
+        </w:drawing>
       </w:r>
     </w:p>
     <w:p>
       <w:pPr>
-        <w:pStyle w:val="Heading2"/>
+        <w:spacing w:line="240" w:lineRule="auto" w:after="140"/>
+        <w:jc w:val="center"/>
       </w:pPr>
       <w:r>
-        <w:t>4.2 Example nutrient interpretation</w:t>
+        <w:t>Figure 4. Original food documents and observations linked to the first food.</w:t>
       </w:r>
     </w:p>
     <w:p>
@@ -2768,18 +2099,7 @@
         <w:rPr>
           <w:b w:val="0"/>
         </w:rPr>
-        <w:t>For branded_food protein (nutrient ID 1003), 32,840 usable observations have a total recorded amount of 242,187.06 G and a mean of approximately 7.37476 G per observation. Mean equals total divided by observation count. These figures summarise a product group, not the protein in one named food or an amount consumed.</w:t>
-      </w:r>
-    </w:p>
-    <w:p>
-      <w:pPr>
-        <w:jc w:val="both"/>
-      </w:pPr>
-      <w:r>
-        <w:rPr>
-          <w:b w:val="0"/>
-        </w:rPr>
-        <w:t>Raw document previews were captured later from a metadata-matching database and are labelled accordingly in the dashboard. They demonstrate linkage without implying that the later preview capture was part of the original benchmark timing.</w:t>
+        <w:t>Food ID 1105904 is WESSON Vegetable Oil 1 GAL. Its preview includes polyunsaturated fatty acids (53.33 G), cholesterol (0 MG) and energy (867 KCAL). These are source observations, not grouped totals. The preview is explicitly labelled as captured later from a matching database; it does not alter the earlier benchmark.</w:t>
       </w:r>
     </w:p>
     <w:p>
@@ -2792,15 +2112,105 @@
         <w:pStyle w:val="Heading1"/>
       </w:pPr>
       <w:r>
-        <w:t>5. HDFS File Management and MapReduce</w:t>
+        <w:t>5. MongoDB Aggregation and Profiling</w:t>
       </w:r>
     </w:p>
     <w:p>
       <w:pPr>
-        <w:pStyle w:val="Heading2"/>
+        <w:spacing w:after="60"/>
+        <w:jc w:val="center"/>
       </w:pPr>
       <w:r>
-        <w:t>5.1 Distributed file management</w:t>
+        <w:drawing>
+          <wp:inline xmlns:a="http://schemas.openxmlformats.org/drawingml/2006/main" xmlns:pic="http://schemas.openxmlformats.org/drawingml/2006/picture">
+            <wp:extent cx="5074920" cy="3995251"/>
+            <wp:docPr id="7" name="Picture 7"/>
+            <wp:cNvGraphicFramePr>
+              <a:graphicFrameLocks noChangeAspect="1"/>
+            </wp:cNvGraphicFramePr>
+            <a:graphic>
+              <a:graphicData uri="http://schemas.openxmlformats.org/drawingml/2006/picture">
+                <pic:pic>
+                  <pic:nvPicPr>
+                    <pic:cNvPr id="0" name="Screenshot 2026-10-28 114134.png"/>
+                    <pic:cNvPicPr/>
+                  </pic:nvPicPr>
+                  <pic:blipFill>
+                    <a:blip r:embed="rId17"/>
+                    <a:stretch>
+                      <a:fillRect/>
+                    </a:stretch>
+                  </pic:blipFill>
+                  <pic:spPr>
+                    <a:xfrm>
+                      <a:off x="0" y="0"/>
+                      <a:ext cx="5074920" cy="3995251"/>
+                    </a:xfrm>
+                    <a:prstGeom prst="rect"/>
+                  </pic:spPr>
+                </pic:pic>
+              </a:graphicData>
+            </a:graphic>
+          </wp:inline>
+        </w:drawing>
+      </w:r>
+    </w:p>
+    <w:p>
+      <w:pPr>
+        <w:spacing w:line="240" w:lineRule="auto" w:after="140"/>
+        <w:jc w:val="center"/>
+      </w:pPr>
+      <w:r>
+        <w:t>Figure 5. Linked food documents, aggregation results and faceted overview.</w:t>
+      </w:r>
+    </w:p>
+    <w:p>
+      <w:pPr>
+        <w:spacing w:after="60"/>
+        <w:jc w:val="center"/>
+      </w:pPr>
+      <w:r>
+        <w:drawing>
+          <wp:inline xmlns:a="http://schemas.openxmlformats.org/drawingml/2006/main" xmlns:pic="http://schemas.openxmlformats.org/drawingml/2006/picture">
+            <wp:extent cx="5577840" cy="1501294"/>
+            <wp:docPr id="8" name="Picture 8"/>
+            <wp:cNvGraphicFramePr>
+              <a:graphicFrameLocks noChangeAspect="1"/>
+            </wp:cNvGraphicFramePr>
+            <a:graphic>
+              <a:graphicData uri="http://schemas.openxmlformats.org/drawingml/2006/picture">
+                <pic:pic>
+                  <pic:nvPicPr>
+                    <pic:cNvPr id="0" name="Screenshot 2026-10-28 114142.png"/>
+                    <pic:cNvPicPr/>
+                  </pic:nvPicPr>
+                  <pic:blipFill>
+                    <a:blip r:embed="rId18"/>
+                    <a:stretch>
+                      <a:fillRect/>
+                    </a:stretch>
+                  </pic:blipFill>
+                  <pic:spPr>
+                    <a:xfrm>
+                      <a:off x="0" y="0"/>
+                      <a:ext cx="5577840" cy="1501294"/>
+                    </a:xfrm>
+                    <a:prstGeom prst="rect"/>
+                  </pic:spPr>
+                </pic:pic>
+              </a:graphicData>
+            </a:graphic>
+          </wp:inline>
+        </w:drawing>
+      </w:r>
+    </w:p>
+    <w:p>
+      <w:pPr>
+        <w:spacing w:line="240" w:lineRule="auto" w:after="140"/>
+        <w:jc w:val="center"/>
+      </w:pPr>
+      <w:r>
+        <w:t>Figure 6. Five profiling repetitions per plan: collection scan versus index.</w:t>
       </w:r>
     </w:p>
     <w:p>
@@ -2811,316 +2221,7 @@
         <w:rPr>
           <w:b w:val="0"/>
         </w:rPr>
-        <w:t>Prepared records are uploaded under /user/root/fdc/realdev_1792244956898668695 in the laptop cluster. The prepared subdirectory contains TSV input; mapreduce stores reducer output, pig_clean stores transformed records and hive_rc holds the RCFile copy.</w:t>
-      </w:r>
-    </w:p>
-    <w:tbl>
-      <w:tblPr>
-        <w:tblStyle w:val="TableGrid"/>
-        <w:tblW w:type="auto" w:w="0"/>
-        <w:tblLayout w:type="fixed"/>
-        <w:tblLook w:firstColumn="1" w:firstRow="1" w:lastColumn="0" w:lastRow="0" w:noHBand="0" w:noVBand="1" w:val="04A0"/>
-      </w:tblPr>
-      <w:tblGrid>
-        <w:gridCol w:w="1872"/>
-        <w:gridCol w:w="7128"/>
-      </w:tblGrid>
-      <w:tr>
-        <w:trPr>
-          <w:cantSplit/>
-        </w:trPr>
-        <w:tc>
-          <w:tcPr>
-            <w:tcW w:type="dxa" w:w="1872"/>
-            <w:shd w:fill="EAF2EF"/>
-          </w:tcPr>
-          <w:p>
-            <w:pPr>
-              <w:spacing w:line="252" w:lineRule="auto" w:after="80" w:before="80"/>
-              <w:jc w:val="left"/>
-            </w:pPr>
-            <w:r>
-              <w:rPr>
-                <w:b/>
-                <w:sz w:val="24"/>
-              </w:rPr>
-              <w:t>Operation</w:t>
-            </w:r>
-          </w:p>
-        </w:tc>
-        <w:tc>
-          <w:tcPr>
-            <w:tcW w:type="dxa" w:w="7128"/>
-            <w:shd w:fill="EAF2EF"/>
-          </w:tcPr>
-          <w:p>
-            <w:pPr>
-              <w:spacing w:line="252" w:lineRule="auto" w:after="80" w:before="80"/>
-              <w:jc w:val="left"/>
-            </w:pPr>
-            <w:r>
-              <w:rPr>
-                <w:b/>
-                <w:sz w:val="24"/>
-              </w:rPr>
-              <w:t>Demonstrated behaviour</w:t>
-            </w:r>
-          </w:p>
-        </w:tc>
-      </w:tr>
-      <w:tr>
-        <w:trPr>
-          <w:cantSplit/>
-        </w:trPr>
-        <w:tc>
-          <w:tcPr>
-            <w:tcW w:type="dxa" w:w="1872"/>
-          </w:tcPr>
-          <w:p>
-            <w:pPr>
-              <w:spacing w:line="252" w:lineRule="auto" w:after="80" w:before="80"/>
-              <w:jc w:val="left"/>
-            </w:pPr>
-            <w:r>
-              <w:rPr>
-                <w:b w:val="0"/>
-                <w:sz w:val="24"/>
-              </w:rPr>
-              <w:t>mkdir -p</w:t>
-            </w:r>
-          </w:p>
-        </w:tc>
-        <w:tc>
-          <w:tcPr>
-            <w:tcW w:type="dxa" w:w="7128"/>
-          </w:tcPr>
-          <w:p>
-            <w:pPr>
-              <w:spacing w:line="252" w:lineRule="auto" w:after="80" w:before="80"/>
-              <w:jc w:val="left"/>
-            </w:pPr>
-            <w:r>
-              <w:rPr>
-                <w:b w:val="0"/>
-                <w:sz w:val="24"/>
-              </w:rPr>
-              <w:t>Create the run’s raw, prepared and temporary demo folders.</w:t>
-            </w:r>
-          </w:p>
-        </w:tc>
-      </w:tr>
-      <w:tr>
-        <w:trPr>
-          <w:cantSplit/>
-        </w:trPr>
-        <w:tc>
-          <w:tcPr>
-            <w:tcW w:type="dxa" w:w="1872"/>
-          </w:tcPr>
-          <w:p>
-            <w:pPr>
-              <w:spacing w:line="252" w:lineRule="auto" w:after="80" w:before="80"/>
-              <w:jc w:val="left"/>
-            </w:pPr>
-            <w:r>
-              <w:rPr>
-                <w:b w:val="0"/>
-                <w:sz w:val="24"/>
-              </w:rPr>
-              <w:t>put</w:t>
-            </w:r>
-          </w:p>
-        </w:tc>
-        <w:tc>
-          <w:tcPr>
-            <w:tcW w:type="dxa" w:w="7128"/>
-          </w:tcPr>
-          <w:p>
-            <w:pPr>
-              <w:spacing w:line="252" w:lineRule="auto" w:after="80" w:before="80"/>
-              <w:jc w:val="left"/>
-            </w:pPr>
-            <w:r>
-              <w:rPr>
-                <w:b w:val="0"/>
-                <w:sz w:val="24"/>
-              </w:rPr>
-              <w:t>Upload input files and a small verification probe.</w:t>
-            </w:r>
-          </w:p>
-        </w:tc>
-      </w:tr>
-      <w:tr>
-        <w:trPr>
-          <w:cantSplit/>
-        </w:trPr>
-        <w:tc>
-          <w:tcPr>
-            <w:tcW w:type="dxa" w:w="1872"/>
-          </w:tcPr>
-          <w:p>
-            <w:pPr>
-              <w:spacing w:line="252" w:lineRule="auto" w:after="80" w:before="80"/>
-              <w:jc w:val="left"/>
-            </w:pPr>
-            <w:r>
-              <w:rPr>
-                <w:b w:val="0"/>
-                <w:sz w:val="24"/>
-              </w:rPr>
-              <w:t>cat</w:t>
-            </w:r>
-          </w:p>
-        </w:tc>
-        <w:tc>
-          <w:tcPr>
-            <w:tcW w:type="dxa" w:w="7128"/>
-          </w:tcPr>
-          <w:p>
-            <w:pPr>
-              <w:spacing w:line="252" w:lineRule="auto" w:after="80" w:before="80"/>
-              <w:jc w:val="left"/>
-            </w:pPr>
-            <w:r>
-              <w:rPr>
-                <w:b w:val="0"/>
-                <w:sz w:val="24"/>
-              </w:rPr>
-              <w:t>Read the probe and inspect stored records.</w:t>
-            </w:r>
-          </w:p>
-        </w:tc>
-      </w:tr>
-      <w:tr>
-        <w:trPr>
-          <w:cantSplit/>
-        </w:trPr>
-        <w:tc>
-          <w:tcPr>
-            <w:tcW w:type="dxa" w:w="1872"/>
-          </w:tcPr>
-          <w:p>
-            <w:pPr>
-              <w:spacing w:line="252" w:lineRule="auto" w:after="80" w:before="80"/>
-              <w:jc w:val="left"/>
-            </w:pPr>
-            <w:r>
-              <w:rPr>
-                <w:b w:val="0"/>
-                <w:sz w:val="24"/>
-              </w:rPr>
-              <w:t>get</w:t>
-            </w:r>
-          </w:p>
-        </w:tc>
-        <w:tc>
-          <w:tcPr>
-            <w:tcW w:type="dxa" w:w="7128"/>
-          </w:tcPr>
-          <w:p>
-            <w:pPr>
-              <w:spacing w:line="252" w:lineRule="auto" w:after="80" w:before="80"/>
-              <w:jc w:val="left"/>
-            </w:pPr>
-            <w:r>
-              <w:rPr>
-                <w:b w:val="0"/>
-                <w:sz w:val="24"/>
-              </w:rPr>
-              <w:t>Download the probe and verify identical bytes.</w:t>
-            </w:r>
-          </w:p>
-        </w:tc>
-      </w:tr>
-      <w:tr>
-        <w:trPr>
-          <w:cantSplit/>
-        </w:trPr>
-        <w:tc>
-          <w:tcPr>
-            <w:tcW w:type="dxa" w:w="1872"/>
-          </w:tcPr>
-          <w:p>
-            <w:pPr>
-              <w:spacing w:line="252" w:lineRule="auto" w:after="80" w:before="80"/>
-              <w:jc w:val="left"/>
-            </w:pPr>
-            <w:r>
-              <w:rPr>
-                <w:b w:val="0"/>
-                <w:sz w:val="24"/>
-              </w:rPr>
-              <w:t>rm -r</w:t>
-            </w:r>
-          </w:p>
-        </w:tc>
-        <w:tc>
-          <w:tcPr>
-            <w:tcW w:type="dxa" w:w="7128"/>
-          </w:tcPr>
-          <w:p>
-            <w:pPr>
-              <w:spacing w:line="252" w:lineRule="auto" w:after="80" w:before="80"/>
-              <w:jc w:val="left"/>
-            </w:pPr>
-            <w:r>
-              <w:rPr>
-                <w:b w:val="0"/>
-                <w:sz w:val="24"/>
-              </w:rPr>
-              <w:t>Delete the temporary demo directory, retaining analytical data.</w:t>
-            </w:r>
-          </w:p>
-        </w:tc>
-      </w:tr>
-    </w:tbl>
-    <w:p>
-      <w:pPr>
-        <w:pStyle w:val="Heading2"/>
-      </w:pPr>
-      <w:r>
-        <w:t>5.2 Python Streaming on YARN</w:t>
-      </w:r>
-    </w:p>
-    <w:p>
-      <w:pPr>
-        <w:jc w:val="both"/>
-      </w:pPr>
-      <w:r>
-        <w:rPr>
-          <w:b w:val="0"/>
-        </w:rPr>
-        <w:t>The mapper reads each seven-field nutrient record, validates its numeric amount and excludes negative values. It emits a food-type/nutrient key with the amount and a count of one. Hadoop partitions and sorts the keys; reducers combine each group into observation count, total amount and mean amount without buffering the whole dataset.</w:t>
-      </w:r>
-    </w:p>
-    <w:p>
-      <w:pPr>
-        <w:jc w:val="both"/>
-      </w:pPr>
-      <w:r>
-        <w:rPr>
-          <w:b w:val="0"/>
-        </w:rPr>
-        <w:t>For example, the branded_food / protein group produces 32,840 observations, a total of approximately 242,187.06 and a mean of 7.37476. The dashboard rounds some reducer values for display; reconciliation uses the saved numeric outputs with an explicit floating-point tolerance.</w:t>
-      </w:r>
-    </w:p>
-    <w:p>
-      <w:pPr>
-        <w:pStyle w:val="Heading2"/>
-      </w:pPr>
-      <w:r>
-        <w:t>5.3 Verification</w:t>
-      </w:r>
-    </w:p>
-    <w:p>
-      <w:pPr>
-        <w:jc w:val="both"/>
-      </w:pPr>
-      <w:r>
-        <w:rPr>
-          <w:b w:val="0"/>
-        </w:rPr>
-        <w:t>Recorded evidence identifies two DataNodes and YARN workers worker1 and worker2. A sample Pi MapReduce job checks the execution environment before the food analytics job. The Pi estimate is a cluster diagnostic, not a nutrition result. The saved food results are checked against independent reference calculations and corresponding MongoDB aggregates.</w:t>
+        <w:t>The pipelines use $match, $group, $project, $unwind and $facet. The protein example has 32,840 branded-food observations, total 242,187.06 G and mean 7.37476 G. The lookup examines 50,000 documents without the index and one with it. Median server times are 42 ms and 0 ms; zero is below timer resolution, not zero work.</w:t>
       </w:r>
     </w:p>
     <w:p>
@@ -3133,15 +2234,7 @@
         <w:pStyle w:val="Heading1"/>
       </w:pPr>
       <w:r>
-        <w:t>6. Pig Transformation and Hive Tables</w:t>
-      </w:r>
-    </w:p>
-    <w:p>
-      <w:pPr>
-        <w:pStyle w:val="Heading2"/>
-      </w:pPr>
-      <w:r>
-        <w:t>6.1 Pig Latin cleaning</w:t>
+        <w:t>6. HDFS File Management</w:t>
       </w:r>
     </w:p>
     <w:p>
@@ -3152,316 +2245,56 @@
         <w:rPr>
           <w:b w:val="0"/>
         </w:rPr>
-        <w:t>Pig reads the prepared HDFS nutrient records as a separate branch from MapReduce. It requires non-null food ID, nutrient ID, food type and amount, and keeps amounts greater than or equal to zero. Clean records are written back to HDFS for Hive ingestion.</w:t>
-      </w:r>
-    </w:p>
-    <w:tbl>
-      <w:tblPr>
-        <w:tblStyle w:val="TableGrid"/>
-        <w:tblW w:type="auto" w:w="0"/>
-        <w:tblLayout w:type="fixed"/>
-        <w:tblLook w:firstColumn="1" w:firstRow="1" w:lastColumn="0" w:lastRow="0" w:noHBand="0" w:noVBand="1" w:val="04A0"/>
-      </w:tblPr>
-      <w:tblGrid>
-        <w:gridCol w:w="2995"/>
-        <w:gridCol w:w="2995"/>
-        <w:gridCol w:w="3010"/>
-      </w:tblGrid>
-      <w:tr>
-        <w:trPr>
-          <w:cantSplit/>
-        </w:trPr>
-        <w:tc>
-          <w:tcPr>
-            <w:tcW w:type="dxa" w:w="2995"/>
-            <w:shd w:fill="EAF2EF"/>
-          </w:tcPr>
-          <w:p>
-            <w:pPr>
-              <w:spacing w:line="252" w:lineRule="auto" w:after="80" w:before="80"/>
-              <w:jc w:val="left"/>
-            </w:pPr>
-            <w:r>
-              <w:rPr>
-                <w:b/>
-                <w:sz w:val="24"/>
-              </w:rPr>
-              <w:t>Prepared nutrient rows</w:t>
-            </w:r>
-          </w:p>
-        </w:tc>
-        <w:tc>
-          <w:tcPr>
-            <w:tcW w:type="dxa" w:w="2995"/>
-            <w:shd w:fill="EAF2EF"/>
-          </w:tcPr>
-          <w:p>
-            <w:pPr>
-              <w:spacing w:line="252" w:lineRule="auto" w:after="80" w:before="80"/>
-              <w:jc w:val="left"/>
-            </w:pPr>
-            <w:r>
-              <w:rPr>
-                <w:b/>
-                <w:sz w:val="24"/>
-              </w:rPr>
-              <w:t>Negative rows excluded</w:t>
-            </w:r>
-          </w:p>
-        </w:tc>
-        <w:tc>
-          <w:tcPr>
-            <w:tcW w:type="dxa" w:w="3010"/>
-            <w:shd w:fill="EAF2EF"/>
-          </w:tcPr>
-          <w:p>
-            <w:pPr>
-              <w:spacing w:line="252" w:lineRule="auto" w:after="80" w:before="80"/>
-              <w:jc w:val="left"/>
-            </w:pPr>
-            <w:r>
-              <w:rPr>
-                <w:b/>
-                <w:sz w:val="24"/>
-              </w:rPr>
-              <w:t>Clean rows</w:t>
-            </w:r>
-          </w:p>
-        </w:tc>
-      </w:tr>
-      <w:tr>
-        <w:trPr>
-          <w:cantSplit/>
-        </w:trPr>
-        <w:tc>
-          <w:tcPr>
-            <w:tcW w:type="dxa" w:w="2995"/>
-          </w:tcPr>
-          <w:p>
-            <w:pPr>
-              <w:spacing w:line="252" w:lineRule="auto" w:after="80" w:before="80"/>
-              <w:jc w:val="left"/>
-            </w:pPr>
-            <w:r>
-              <w:rPr>
-                <w:b w:val="0"/>
-                <w:sz w:val="24"/>
-              </w:rPr>
-              <w:t>1,126,928</w:t>
-            </w:r>
-          </w:p>
-        </w:tc>
-        <w:tc>
-          <w:tcPr>
-            <w:tcW w:type="dxa" w:w="2995"/>
-          </w:tcPr>
-          <w:p>
-            <w:pPr>
-              <w:spacing w:line="252" w:lineRule="auto" w:after="80" w:before="80"/>
-              <w:jc w:val="left"/>
-            </w:pPr>
-            <w:r>
-              <w:rPr>
-                <w:b w:val="0"/>
-                <w:sz w:val="24"/>
-              </w:rPr>
-              <w:t>0</w:t>
-            </w:r>
-          </w:p>
-        </w:tc>
-        <w:tc>
-          <w:tcPr>
-            <w:tcW w:type="dxa" w:w="3010"/>
-          </w:tcPr>
-          <w:p>
-            <w:pPr>
-              <w:spacing w:line="252" w:lineRule="auto" w:after="80" w:before="80"/>
-              <w:jc w:val="left"/>
-            </w:pPr>
-            <w:r>
-              <w:rPr>
-                <w:b w:val="0"/>
-                <w:sz w:val="24"/>
-              </w:rPr>
-              <w:t>1,126,928</w:t>
-            </w:r>
-          </w:p>
-        </w:tc>
-      </w:tr>
-    </w:tbl>
-    <w:p>
-      <w:pPr>
-        <w:jc w:val="both"/>
-      </w:pPr>
-      <w:r>
-        <w:rPr>
-          <w:b w:val="0"/>
-        </w:rPr>
-        <w:t>Zero excluded negative values means that this subset’s prepared input already satisfies the nonnegative filter; the cleaning script still executes and validates its output. Pig does not modify MongoDB documents or clean the MapReduce output.</w:t>
+        <w:t>The 50,000-food run stores prepared input and analytical outputs under /user/root/fdc/realdev_1792244956898668695. The HDFS demonstration creates directories, uploads files, reads a probe, downloads and byte-checks it, then deletes only the temporary demo directory.</w:t>
       </w:r>
     </w:p>
     <w:p>
       <w:pPr>
-        <w:pStyle w:val="Heading2"/>
+        <w:spacing w:after="60"/>
+        <w:jc w:val="center"/>
       </w:pPr>
       <w:r>
-        <w:t>6.2 Equivalent Hive datasets</w:t>
-      </w:r>
-    </w:p>
-    <w:tbl>
-      <w:tblPr>
-        <w:tblStyle w:val="TableGrid"/>
-        <w:tblW w:type="auto" w:w="0"/>
-        <w:tblLayout w:type="fixed"/>
-        <w:tblLook w:firstColumn="1" w:firstRow="1" w:lastColumn="0" w:lastRow="0" w:noHBand="0" w:noVBand="1" w:val="04A0"/>
-      </w:tblPr>
-      <w:tblGrid>
-        <w:gridCol w:w="2880"/>
-        <w:gridCol w:w="6120"/>
-      </w:tblGrid>
-      <w:tr>
-        <w:trPr>
-          <w:cantSplit/>
-        </w:trPr>
-        <w:tc>
-          <w:tcPr>
-            <w:tcW w:type="dxa" w:w="2880"/>
-            <w:shd w:fill="EAF2EF"/>
-          </w:tcPr>
-          <w:p>
-            <w:pPr>
-              <w:spacing w:line="252" w:lineRule="auto" w:after="80" w:before="80"/>
-              <w:jc w:val="left"/>
-            </w:pPr>
-            <w:r>
-              <w:rPr>
-                <w:b/>
-                <w:sz w:val="24"/>
-              </w:rPr>
-              <w:t>Table</w:t>
-            </w:r>
-          </w:p>
-        </w:tc>
-        <w:tc>
-          <w:tcPr>
-            <w:tcW w:type="dxa" w:w="6120"/>
-            <w:shd w:fill="EAF2EF"/>
-          </w:tcPr>
-          <w:p>
-            <w:pPr>
-              <w:spacing w:line="252" w:lineRule="auto" w:after="80" w:before="80"/>
-              <w:jc w:val="left"/>
-            </w:pPr>
-            <w:r>
-              <w:rPr>
-                <w:b/>
-                <w:sz w:val="24"/>
-              </w:rPr>
-              <w:t>Stored data and format</w:t>
-            </w:r>
-          </w:p>
-        </w:tc>
-      </w:tr>
-      <w:tr>
-        <w:trPr>
-          <w:cantSplit/>
-        </w:trPr>
-        <w:tc>
-          <w:tcPr>
-            <w:tcW w:type="dxa" w:w="2880"/>
-          </w:tcPr>
-          <w:p>
-            <w:pPr>
-              <w:spacing w:line="252" w:lineRule="auto" w:after="80" w:before="80"/>
-              <w:jc w:val="left"/>
-            </w:pPr>
-            <w:r>
-              <w:rPr>
-                <w:b w:val="0"/>
-                <w:sz w:val="24"/>
-              </w:rPr>
-              <w:t>nutrients_text</w:t>
-            </w:r>
-          </w:p>
-        </w:tc>
-        <w:tc>
-          <w:tcPr>
-            <w:tcW w:type="dxa" w:w="6120"/>
-          </w:tcPr>
-          <w:p>
-            <w:pPr>
-              <w:spacing w:line="252" w:lineRule="auto" w:after="80" w:before="80"/>
-              <w:jc w:val="left"/>
-            </w:pPr>
-            <w:r>
-              <w:rPr>
-                <w:b w:val="0"/>
-                <w:sz w:val="24"/>
-              </w:rPr>
-              <w:t>External table over Pig’s tab-separated cleaned records.</w:t>
-            </w:r>
-          </w:p>
-        </w:tc>
-      </w:tr>
-      <w:tr>
-        <w:trPr>
-          <w:cantSplit/>
-        </w:trPr>
-        <w:tc>
-          <w:tcPr>
-            <w:tcW w:type="dxa" w:w="2880"/>
-          </w:tcPr>
-          <w:p>
-            <w:pPr>
-              <w:spacing w:line="252" w:lineRule="auto" w:after="80" w:before="80"/>
-              <w:jc w:val="left"/>
-            </w:pPr>
-            <w:r>
-              <w:rPr>
-                <w:b w:val="0"/>
-                <w:sz w:val="24"/>
-              </w:rPr>
-              <w:t>nutrients_rcfile</w:t>
-            </w:r>
-          </w:p>
-        </w:tc>
-        <w:tc>
-          <w:tcPr>
-            <w:tcW w:type="dxa" w:w="6120"/>
-          </w:tcPr>
-          <w:p>
-            <w:pPr>
-              <w:spacing w:line="252" w:lineRule="auto" w:after="80" w:before="80"/>
-              <w:jc w:val="left"/>
-            </w:pPr>
-            <w:r>
-              <w:rPr>
-                <w:b w:val="0"/>
-                <w:sz w:val="24"/>
-              </w:rPr>
-              <w:t>The same rows copied into gzip-compressed RCFile storage.</w:t>
-            </w:r>
-          </w:p>
-        </w:tc>
-      </w:tr>
-    </w:tbl>
-    <w:p>
-      <w:pPr>
-        <w:jc w:val="both"/>
-      </w:pPr>
-      <w:r>
-        <w:rPr>
-          <w:b w:val="0"/>
-        </w:rPr>
-        <w:t>Each table has seven columns: fdc_id, data_type, food_category_id, nutrient_id, nutrient_name, unit and amount. The RCFile table is populated using INSERT OVERWRITE ... SELECT * FROM nutrients_text. The two stored datasets are created once per processing run and reused by all query repetitions.</w:t>
+        <w:drawing>
+          <wp:inline xmlns:a="http://schemas.openxmlformats.org/drawingml/2006/main" xmlns:pic="http://schemas.openxmlformats.org/drawingml/2006/picture">
+            <wp:extent cx="5394960" cy="4563237"/>
+            <wp:docPr id="9" name="Picture 9"/>
+            <wp:cNvGraphicFramePr>
+              <a:graphicFrameLocks noChangeAspect="1"/>
+            </wp:cNvGraphicFramePr>
+            <a:graphic>
+              <a:graphicData uri="http://schemas.openxmlformats.org/drawingml/2006/picture">
+                <pic:pic>
+                  <pic:nvPicPr>
+                    <pic:cNvPr id="0" name="Screenshot 2026-10-28 114153.png"/>
+                    <pic:cNvPicPr/>
+                  </pic:nvPicPr>
+                  <pic:blipFill>
+                    <a:blip r:embed="rId19"/>
+                    <a:stretch>
+                      <a:fillRect/>
+                    </a:stretch>
+                  </pic:blipFill>
+                  <pic:spPr>
+                    <a:xfrm>
+                      <a:off x="0" y="0"/>
+                      <a:ext cx="5394960" cy="4563237"/>
+                    </a:xfrm>
+                    <a:prstGeom prst="rect"/>
+                  </pic:spPr>
+                </pic:pic>
+              </a:graphicData>
+            </a:graphic>
+          </wp:inline>
+        </w:drawing>
       </w:r>
     </w:p>
     <w:p>
       <w:pPr>
-        <w:pStyle w:val="Heading2"/>
+        <w:spacing w:line="240" w:lineRule="auto" w:after="140"/>
+        <w:jc w:val="center"/>
       </w:pPr>
       <w:r>
-        <w:t>6.3 Analytical queries</w:t>
+        <w:t>Figure 7. HDFS input samples and verified mkdir, put, cat, get and rm -r operations.</w:t>
       </w:r>
     </w:p>
     <w:p>
@@ -3472,7 +2305,7 @@
         <w:rPr>
           <w:b w:val="0"/>
         </w:rPr>
-        <w:t>Query 1 groups all nonnegative nutrient observations by food type, nutrient ID and unit, returning COUNT, SUM and AVG. Query 2 performs the same calculation for protein only, with nutrient_id = 1003 and unit G. Each question is executed against both tables. One warmup and one measured execution per query/table pair give eight executions, not eight distinct analytical questions.</w:t>
+        <w:t>Prepared food and nutrient TSV files are retained as inputs. The mapreduce, pig_clean and hive_rc directories contain reducer output, Pig-cleaned rows and the converted Hive dataset. The adjacent commands inspect those stored files; merely viewing the dashboard does not repeat file operations.</w:t>
       </w:r>
     </w:p>
     <w:p>
@@ -3485,7 +2318,7 @@
         <w:pStyle w:val="Heading1"/>
       </w:pPr>
       <w:r>
-        <w:t>7. Hive Performance and Storage Results</w:t>
+        <w:t>7. MapReduce Analytics on YARN</w:t>
       </w:r>
     </w:p>
     <w:p>
@@ -3496,202 +2329,248 @@
         <w:rPr>
           <w:b w:val="0"/>
         </w:rPr>
-        <w:t>The benchmark excludes warmups from the reported query times. Each table/query pair has one measured execution. Elapsed time includes Beeline startup and no cache flush is performed; the measurements describe this development run.</w:t>
+        <w:t>The Python Streaming mapper reads seven-field records, validates numeric amounts and excludes negative values. It emits a food-type/nutrient key with amount and count. Hadoop partitions and sorts the keys, and each reducer calculates observation count, total and mean without buffering the whole group.</w:t>
       </w:r>
     </w:p>
-    <w:tbl>
-      <w:tblPr>
-        <w:tblStyle w:val="TableGrid"/>
-        <w:tblW w:type="auto" w:w="0"/>
-        <w:tblLayout w:type="fixed"/>
-        <w:tblLook w:firstColumn="1" w:firstRow="1" w:lastColumn="0" w:lastRow="0" w:noHBand="0" w:noVBand="1" w:val="04A0"/>
-      </w:tblPr>
-      <w:tblGrid>
-        <w:gridCol w:w="4392"/>
-        <w:gridCol w:w="2304"/>
-        <w:gridCol w:w="2304"/>
-      </w:tblGrid>
-      <w:tr>
-        <w:trPr>
-          <w:cantSplit/>
-        </w:trPr>
-        <w:tc>
-          <w:tcPr>
-            <w:tcW w:type="dxa" w:w="4392"/>
-            <w:shd w:fill="EAF2EF"/>
-          </w:tcPr>
-          <w:p>
-            <w:pPr>
-              <w:spacing w:line="252" w:lineRule="auto" w:after="80" w:before="80"/>
-              <w:jc w:val="left"/>
-            </w:pPr>
-            <w:r>
-              <w:rPr>
-                <w:b/>
-                <w:sz w:val="24"/>
-              </w:rPr>
-              <w:t>Question</w:t>
-            </w:r>
-          </w:p>
-        </w:tc>
-        <w:tc>
-          <w:tcPr>
-            <w:tcW w:type="dxa" w:w="2304"/>
-            <w:shd w:fill="EAF2EF"/>
-          </w:tcPr>
-          <w:p>
-            <w:pPr>
-              <w:spacing w:line="252" w:lineRule="auto" w:after="80" w:before="80"/>
-              <w:jc w:val="left"/>
-            </w:pPr>
-            <w:r>
-              <w:rPr>
-                <w:b/>
-                <w:sz w:val="24"/>
-              </w:rPr>
-              <w:t>Text (s)</w:t>
-            </w:r>
-          </w:p>
-        </w:tc>
-        <w:tc>
-          <w:tcPr>
-            <w:tcW w:type="dxa" w:w="2304"/>
-            <w:shd w:fill="EAF2EF"/>
-          </w:tcPr>
-          <w:p>
-            <w:pPr>
-              <w:spacing w:line="252" w:lineRule="auto" w:after="80" w:before="80"/>
-              <w:jc w:val="left"/>
-            </w:pPr>
-            <w:r>
-              <w:rPr>
-                <w:b/>
-                <w:sz w:val="24"/>
-              </w:rPr>
-              <w:t>RCFile (s)</w:t>
-            </w:r>
-          </w:p>
-        </w:tc>
-      </w:tr>
-      <w:tr>
-        <w:trPr>
-          <w:cantSplit/>
-        </w:trPr>
-        <w:tc>
-          <w:tcPr>
-            <w:tcW w:type="dxa" w:w="4392"/>
-          </w:tcPr>
-          <w:p>
-            <w:pPr>
-              <w:spacing w:line="252" w:lineRule="auto" w:after="80" w:before="80"/>
-              <w:jc w:val="left"/>
-            </w:pPr>
-            <w:r>
-              <w:rPr>
-                <w:b w:val="0"/>
-                <w:sz w:val="24"/>
-              </w:rPr>
-              <w:t>All-nutrient summary</w:t>
-            </w:r>
-          </w:p>
-        </w:tc>
-        <w:tc>
-          <w:tcPr>
-            <w:tcW w:type="dxa" w:w="2304"/>
-          </w:tcPr>
-          <w:p>
-            <w:pPr>
-              <w:spacing w:line="252" w:lineRule="auto" w:after="80" w:before="80"/>
-              <w:jc w:val="left"/>
-            </w:pPr>
-            <w:r>
-              <w:rPr>
-                <w:b w:val="0"/>
-                <w:sz w:val="24"/>
-              </w:rPr>
-              <w:t>66.24</w:t>
-            </w:r>
-          </w:p>
-        </w:tc>
-        <w:tc>
-          <w:tcPr>
-            <w:tcW w:type="dxa" w:w="2304"/>
-          </w:tcPr>
-          <w:p>
-            <w:pPr>
-              <w:spacing w:line="252" w:lineRule="auto" w:after="80" w:before="80"/>
-              <w:jc w:val="left"/>
-            </w:pPr>
-            <w:r>
-              <w:rPr>
-                <w:b w:val="0"/>
-                <w:sz w:val="24"/>
-              </w:rPr>
-              <w:t>64.22</w:t>
-            </w:r>
-          </w:p>
-        </w:tc>
-      </w:tr>
-      <w:tr>
-        <w:trPr>
-          <w:cantSplit/>
-        </w:trPr>
-        <w:tc>
-          <w:tcPr>
-            <w:tcW w:type="dxa" w:w="4392"/>
-          </w:tcPr>
-          <w:p>
-            <w:pPr>
-              <w:spacing w:line="252" w:lineRule="auto" w:after="80" w:before="80"/>
-              <w:jc w:val="left"/>
-            </w:pPr>
-            <w:r>
-              <w:rPr>
-                <w:b w:val="0"/>
-                <w:sz w:val="24"/>
-              </w:rPr>
-              <w:t>Protein summary</w:t>
-            </w:r>
-          </w:p>
-        </w:tc>
-        <w:tc>
-          <w:tcPr>
-            <w:tcW w:type="dxa" w:w="2304"/>
-          </w:tcPr>
-          <w:p>
-            <w:pPr>
-              <w:spacing w:line="252" w:lineRule="auto" w:after="80" w:before="80"/>
-              <w:jc w:val="left"/>
-            </w:pPr>
-            <w:r>
-              <w:rPr>
-                <w:b w:val="0"/>
-                <w:sz w:val="24"/>
-              </w:rPr>
-              <w:t>64.91</w:t>
-            </w:r>
-          </w:p>
-        </w:tc>
-        <w:tc>
-          <w:tcPr>
-            <w:tcW w:type="dxa" w:w="2304"/>
-          </w:tcPr>
-          <w:p>
-            <w:pPr>
-              <w:spacing w:line="252" w:lineRule="auto" w:after="80" w:before="80"/>
-              <w:jc w:val="left"/>
-            </w:pPr>
-            <w:r>
-              <w:rPr>
-                <w:b w:val="0"/>
-                <w:sz w:val="24"/>
-              </w:rPr>
-              <w:t>67.35</w:t>
-            </w:r>
-          </w:p>
-        </w:tc>
-      </w:tr>
-    </w:tbl>
+    <w:p>
+      <w:pPr>
+        <w:spacing w:after="60"/>
+        <w:jc w:val="center"/>
+      </w:pPr>
+      <w:r>
+        <w:drawing>
+          <wp:inline xmlns:a="http://schemas.openxmlformats.org/drawingml/2006/main" xmlns:pic="http://schemas.openxmlformats.org/drawingml/2006/picture">
+            <wp:extent cx="5577840" cy="3362369"/>
+            <wp:docPr id="10" name="Picture 10"/>
+            <wp:cNvGraphicFramePr>
+              <a:graphicFrameLocks noChangeAspect="1"/>
+            </wp:cNvGraphicFramePr>
+            <a:graphic>
+              <a:graphicData uri="http://schemas.openxmlformats.org/drawingml/2006/picture">
+                <pic:pic>
+                  <pic:nvPicPr>
+                    <pic:cNvPr id="0" name="Screenshot 2026-10-28 114209.png"/>
+                    <pic:cNvPicPr/>
+                  </pic:nvPicPr>
+                  <pic:blipFill>
+                    <a:blip r:embed="rId20"/>
+                    <a:stretch>
+                      <a:fillRect/>
+                    </a:stretch>
+                  </pic:blipFill>
+                  <pic:spPr>
+                    <a:xfrm>
+                      <a:off x="0" y="0"/>
+                      <a:ext cx="5577840" cy="3362369"/>
+                    </a:xfrm>
+                    <a:prstGeom prst="rect"/>
+                  </pic:spPr>
+                </pic:pic>
+              </a:graphicData>
+            </a:graphic>
+          </wp:inline>
+        </w:drawing>
+      </w:r>
+    </w:p>
+    <w:p>
+      <w:pPr>
+        <w:spacing w:line="240" w:lineRule="auto" w:after="140"/>
+        <w:jc w:val="center"/>
+      </w:pPr>
+      <w:r>
+        <w:t>Figure 8. Partial reducer output and recorded worker registration.</w:t>
+      </w:r>
+    </w:p>
+    <w:p>
+      <w:pPr>
+        <w:jc w:val="both"/>
+      </w:pPr>
+      <w:r>
+        <w:rPr>
+          <w:b w:val="0"/>
+        </w:rPr>
+        <w:t>For branded_food / protein, MapReduce returns 32,840 observations, total approximately 242,187.06 and mean 7.37476. The screen rounds some numbers for readability; saved numeric outputs are compared using a floating-point tolerance.</w:t>
+      </w:r>
+    </w:p>
+    <w:p>
+      <w:pPr>
+        <w:jc w:val="both"/>
+      </w:pPr>
+      <w:r>
+        <w:rPr>
+          <w:b w:val="0"/>
+        </w:rPr>
+        <w:t>Independent reference calculations and MongoDB aggregates are reconciled with the distributed output. This checks that the same records were used and that counts, sums and means agree. Two DataNodes and two YARN workers, worker1 and worker2, are recorded for the selected run.</w:t>
+      </w:r>
+    </w:p>
+    <w:p>
+      <w:r>
+        <w:br w:type="page"/>
+      </w:r>
+    </w:p>
+    <w:p>
+      <w:pPr>
+        <w:pStyle w:val="Heading1"/>
+      </w:pPr>
+      <w:r>
+        <w:t>8. Pig Transformation and Hive Tables</w:t>
+      </w:r>
+    </w:p>
+    <w:p>
+      <w:pPr>
+        <w:jc w:val="both"/>
+      </w:pPr>
+      <w:r>
+        <w:rPr>
+          <w:b w:val="0"/>
+        </w:rPr>
+        <w:t>Pig reads the prepared HDFS input independently of MapReduce. It keeps non-null food IDs, nutrient IDs, food types and nonnegative amounts. All 1,126,928 prepared observations remain after cleaning; zero negative values are excluded in this subset.</w:t>
+      </w:r>
+    </w:p>
+    <w:p>
+      <w:pPr>
+        <w:spacing w:after="60"/>
+        <w:jc w:val="center"/>
+      </w:pPr>
+      <w:r>
+        <w:drawing>
+          <wp:inline xmlns:a="http://schemas.openxmlformats.org/drawingml/2006/main" xmlns:pic="http://schemas.openxmlformats.org/drawingml/2006/picture">
+            <wp:extent cx="5440680" cy="3856685"/>
+            <wp:docPr id="11" name="Picture 11"/>
+            <wp:cNvGraphicFramePr>
+              <a:graphicFrameLocks noChangeAspect="1"/>
+            </wp:cNvGraphicFramePr>
+            <a:graphic>
+              <a:graphicData uri="http://schemas.openxmlformats.org/drawingml/2006/picture">
+                <pic:pic>
+                  <pic:nvPicPr>
+                    <pic:cNvPr id="0" name="Screenshot 2026-10-28 114219.png"/>
+                    <pic:cNvPicPr/>
+                  </pic:nvPicPr>
+                  <pic:blipFill>
+                    <a:blip r:embed="rId21"/>
+                    <a:stretch>
+                      <a:fillRect/>
+                    </a:stretch>
+                  </pic:blipFill>
+                  <pic:spPr>
+                    <a:xfrm>
+                      <a:off x="0" y="0"/>
+                      <a:ext cx="5440680" cy="3856685"/>
+                    </a:xfrm>
+                    <a:prstGeom prst="rect"/>
+                  </pic:spPr>
+                </pic:pic>
+              </a:graphicData>
+            </a:graphic>
+          </wp:inline>
+        </w:drawing>
+      </w:r>
+    </w:p>
+    <w:p>
+      <w:pPr>
+        <w:spacing w:line="240" w:lineRule="auto" w:after="140"/>
+        <w:jc w:val="center"/>
+      </w:pPr>
+      <w:r>
+        <w:t>Figure 9. Pig accounting, equivalent Hive datasets and partial analytical results.</w:t>
+      </w:r>
+    </w:p>
+    <w:p>
+      <w:pPr>
+        <w:jc w:val="both"/>
+      </w:pPr>
+      <w:r>
+        <w:rPr>
+          <w:b w:val="0"/>
+        </w:rPr>
+        <w:t>nutrients_text points to Pig’s tab-separated output; nutrients_rcfile stores the same rows in gzip-compressed RCFile format. These datasets are created once per processing run and reused. Query answers are saved separately as TSV files, with logs and benchmark metadata.</w:t>
+      </w:r>
+    </w:p>
+    <w:p>
+      <w:pPr>
+        <w:jc w:val="both"/>
+      </w:pPr>
+      <w:r>
+        <w:rPr>
+          <w:b w:val="0"/>
+        </w:rPr>
+        <w:t>Two questions calculate COUNT, SUM and AVG by food type, nutrient ID and unit: an all-nutrient summary and a protein-only summary (ID 1003, unit G). Both run on both tables, once for warmup and once for measurement: eight executions in total.</w:t>
+      </w:r>
+    </w:p>
+    <w:p>
+      <w:r>
+        <w:br w:type="page"/>
+      </w:r>
+    </w:p>
+    <w:p>
+      <w:pPr>
+        <w:pStyle w:val="Heading1"/>
+      </w:pPr>
+      <w:r>
+        <w:t>9. Hive Performance and Storage Results</w:t>
+      </w:r>
+    </w:p>
+    <w:p>
+      <w:pPr>
+        <w:spacing w:after="60"/>
+        <w:jc w:val="center"/>
+      </w:pPr>
+      <w:r>
+        <w:drawing>
+          <wp:inline xmlns:a="http://schemas.openxmlformats.org/drawingml/2006/main" xmlns:pic="http://schemas.openxmlformats.org/drawingml/2006/picture">
+            <wp:extent cx="5577840" cy="2905749"/>
+            <wp:docPr id="12" name="Picture 12"/>
+            <wp:cNvGraphicFramePr>
+              <a:graphicFrameLocks noChangeAspect="1"/>
+            </wp:cNvGraphicFramePr>
+            <a:graphic>
+              <a:graphicData uri="http://schemas.openxmlformats.org/drawingml/2006/picture">
+                <pic:pic>
+                  <pic:nvPicPr>
+                    <pic:cNvPr id="0" name="Screenshot 2026-10-28 114226.png"/>
+                    <pic:cNvPicPr/>
+                  </pic:nvPicPr>
+                  <pic:blipFill>
+                    <a:blip r:embed="rId22"/>
+                    <a:stretch>
+                      <a:fillRect/>
+                    </a:stretch>
+                  </pic:blipFill>
+                  <pic:spPr>
+                    <a:xfrm>
+                      <a:off x="0" y="0"/>
+                      <a:ext cx="5577840" cy="2905749"/>
+                    </a:xfrm>
+                    <a:prstGeom prst="rect"/>
+                  </pic:spPr>
+                </pic:pic>
+              </a:graphicData>
+            </a:graphic>
+          </wp:inline>
+        </w:drawing>
+      </w:r>
+    </w:p>
+    <w:p>
+      <w:pPr>
+        <w:spacing w:line="240" w:lineRule="auto" w:after="140"/>
+        <w:jc w:val="center"/>
+      </w:pPr>
+      <w:r>
+        <w:t>Figure 10. Recorded query times and Text/RCFile storage measurements.</w:t>
+      </w:r>
+    </w:p>
+    <w:p>
+      <w:pPr>
+        <w:jc w:val="both"/>
+      </w:pPr>
+      <w:r>
+        <w:rPr>
+          <w:b w:val="0"/>
+        </w:rPr>
+        <w:t>The all-nutrient query takes 66.24 s on Text and 64.22 s on RCFile. The protein query takes 64.91 s and 67.35 s respectively. There is one measured execution per question/table pair; warmups are excluded. Elapsed time includes Beeline startup and no cache flush is performed.</w:t>
+      </w:r>
+    </w:p>
     <w:p>
       <w:pPr>
         <w:jc w:val="center"/>
@@ -3699,8 +2578,8 @@
       <w:r>
         <w:drawing>
           <wp:inline xmlns:a="http://schemas.openxmlformats.org/drawingml/2006/main" xmlns:pic="http://schemas.openxmlformats.org/drawingml/2006/picture">
-            <wp:extent cx="4846320" cy="2241423"/>
-            <wp:docPr id="4" name="Picture 4"/>
+            <wp:extent cx="4754880" cy="1901952"/>
+            <wp:docPr id="13" name="Picture 13"/>
             <wp:cNvGraphicFramePr>
               <a:graphicFrameLocks noChangeAspect="1"/>
             </wp:cNvGraphicFramePr>
@@ -3708,11 +2587,11 @@
               <a:graphicData uri="http://schemas.openxmlformats.org/drawingml/2006/picture">
                 <pic:pic>
                   <pic:nvPicPr>
-                    <pic:cNvPr id="0" name="hive_times.png"/>
+                    <pic:cNvPr id="0" name="hive_storage.png"/>
                     <pic:cNvPicPr/>
                   </pic:nvPicPr>
                   <pic:blipFill>
-                    <a:blip r:embed="rId14"/>
+                    <a:blip r:embed="rId23"/>
                     <a:stretch>
                       <a:fillRect/>
                     </a:stretch>
@@ -3720,7 +2599,7 @@
                   <pic:spPr>
                     <a:xfrm>
                       <a:off x="0" y="0"/>
-                      <a:ext cx="4846320" cy="2241423"/>
+                      <a:ext cx="4754880" cy="1901952"/>
                     </a:xfrm>
                     <a:prstGeom prst="rect"/>
                   </pic:spPr>
@@ -3737,202 +2616,9 @@
         <w:jc w:val="center"/>
       </w:pPr>
       <w:r>
-        <w:t>Figure 2. Identical query workloads measured on Text and RCFile.</w:t>
+        <w:t>Figure 11. Logical storage for equivalent cleaned input (decimal MB).</w:t>
       </w:r>
     </w:p>
-    <w:tbl>
-      <w:tblPr>
-        <w:tblStyle w:val="TableGrid"/>
-        <w:tblW w:type="auto" w:w="0"/>
-        <w:tblLayout w:type="fixed"/>
-        <w:tblLook w:firstColumn="1" w:firstRow="1" w:lastColumn="0" w:lastRow="0" w:noHBand="0" w:noVBand="1" w:val="04A0"/>
-      </w:tblPr>
-      <w:tblGrid>
-        <w:gridCol w:w="2952"/>
-        <w:gridCol w:w="3024"/>
-        <w:gridCol w:w="3024"/>
-      </w:tblGrid>
-      <w:tr>
-        <w:trPr>
-          <w:cantSplit/>
-        </w:trPr>
-        <w:tc>
-          <w:tcPr>
-            <w:tcW w:type="dxa" w:w="2952"/>
-            <w:shd w:fill="EAF2EF"/>
-          </w:tcPr>
-          <w:p>
-            <w:pPr>
-              <w:spacing w:line="252" w:lineRule="auto" w:after="80" w:before="80"/>
-              <w:jc w:val="left"/>
-            </w:pPr>
-            <w:r>
-              <w:rPr>
-                <w:b/>
-                <w:sz w:val="24"/>
-              </w:rPr>
-              <w:t>Format</w:t>
-            </w:r>
-          </w:p>
-        </w:tc>
-        <w:tc>
-          <w:tcPr>
-            <w:tcW w:type="dxa" w:w="3024"/>
-            <w:shd w:fill="EAF2EF"/>
-          </w:tcPr>
-          <w:p>
-            <w:pPr>
-              <w:spacing w:line="252" w:lineRule="auto" w:after="80" w:before="80"/>
-              <w:jc w:val="left"/>
-            </w:pPr>
-            <w:r>
-              <w:rPr>
-                <w:b/>
-                <w:sz w:val="24"/>
-              </w:rPr>
-              <w:t>Logical bytes</w:t>
-            </w:r>
-          </w:p>
-        </w:tc>
-        <w:tc>
-          <w:tcPr>
-            <w:tcW w:type="dxa" w:w="3024"/>
-            <w:shd w:fill="EAF2EF"/>
-          </w:tcPr>
-          <w:p>
-            <w:pPr>
-              <w:spacing w:line="252" w:lineRule="auto" w:after="80" w:before="80"/>
-              <w:jc w:val="left"/>
-            </w:pPr>
-            <w:r>
-              <w:rPr>
-                <w:b/>
-                <w:sz w:val="24"/>
-              </w:rPr>
-              <w:t>Replicated bytes</w:t>
-            </w:r>
-          </w:p>
-        </w:tc>
-      </w:tr>
-      <w:tr>
-        <w:trPr>
-          <w:cantSplit/>
-        </w:trPr>
-        <w:tc>
-          <w:tcPr>
-            <w:tcW w:type="dxa" w:w="2952"/>
-          </w:tcPr>
-          <w:p>
-            <w:pPr>
-              <w:spacing w:line="252" w:lineRule="auto" w:after="80" w:before="80"/>
-              <w:jc w:val="left"/>
-            </w:pPr>
-            <w:r>
-              <w:rPr>
-                <w:b w:val="0"/>
-                <w:sz w:val="24"/>
-              </w:rPr>
-              <w:t>Text</w:t>
-            </w:r>
-          </w:p>
-        </w:tc>
-        <w:tc>
-          <w:tcPr>
-            <w:tcW w:type="dxa" w:w="3024"/>
-          </w:tcPr>
-          <w:p>
-            <w:pPr>
-              <w:spacing w:line="252" w:lineRule="auto" w:after="80" w:before="80"/>
-              <w:jc w:val="left"/>
-            </w:pPr>
-            <w:r>
-              <w:rPr>
-                <w:b w:val="0"/>
-                <w:sz w:val="24"/>
-              </w:rPr>
-              <w:t>67,081,701</w:t>
-            </w:r>
-          </w:p>
-        </w:tc>
-        <w:tc>
-          <w:tcPr>
-            <w:tcW w:type="dxa" w:w="3024"/>
-          </w:tcPr>
-          <w:p>
-            <w:pPr>
-              <w:spacing w:line="252" w:lineRule="auto" w:after="80" w:before="80"/>
-              <w:jc w:val="left"/>
-            </w:pPr>
-            <w:r>
-              <w:rPr>
-                <w:b w:val="0"/>
-                <w:sz w:val="24"/>
-              </w:rPr>
-              <w:t>134,163,402</w:t>
-            </w:r>
-          </w:p>
-        </w:tc>
-      </w:tr>
-      <w:tr>
-        <w:trPr>
-          <w:cantSplit/>
-        </w:trPr>
-        <w:tc>
-          <w:tcPr>
-            <w:tcW w:type="dxa" w:w="2952"/>
-          </w:tcPr>
-          <w:p>
-            <w:pPr>
-              <w:spacing w:line="252" w:lineRule="auto" w:after="80" w:before="80"/>
-              <w:jc w:val="left"/>
-            </w:pPr>
-            <w:r>
-              <w:rPr>
-                <w:b w:val="0"/>
-                <w:sz w:val="24"/>
-              </w:rPr>
-              <w:t>RCFile</w:t>
-            </w:r>
-          </w:p>
-        </w:tc>
-        <w:tc>
-          <w:tcPr>
-            <w:tcW w:type="dxa" w:w="3024"/>
-          </w:tcPr>
-          <w:p>
-            <w:pPr>
-              <w:spacing w:line="252" w:lineRule="auto" w:after="80" w:before="80"/>
-              <w:jc w:val="left"/>
-            </w:pPr>
-            <w:r>
-              <w:rPr>
-                <w:b w:val="0"/>
-                <w:sz w:val="24"/>
-              </w:rPr>
-              <w:t>6,622,922</w:t>
-            </w:r>
-          </w:p>
-        </w:tc>
-        <w:tc>
-          <w:tcPr>
-            <w:tcW w:type="dxa" w:w="3024"/>
-          </w:tcPr>
-          <w:p>
-            <w:pPr>
-              <w:spacing w:line="252" w:lineRule="auto" w:after="80" w:before="80"/>
-              <w:jc w:val="left"/>
-            </w:pPr>
-            <w:r>
-              <w:rPr>
-                <w:b w:val="0"/>
-                <w:sz w:val="24"/>
-              </w:rPr>
-              <w:t>13,245,844</w:t>
-            </w:r>
-          </w:p>
-        </w:tc>
-      </w:tr>
-    </w:tbl>
     <w:p>
       <w:pPr>
         <w:jc w:val="both"/>
@@ -3941,7 +2627,7 @@
         <w:rPr>
           <w:b w:val="0"/>
         </w:rPr>
-        <w:t>RCFile uses approximately 90.13% less logical storage in this run. It is 2.02 seconds faster for the all-nutrient query and 2.44 seconds slower for protein. The result supports a substantial storage reduction, while these short timing measurements do not establish a consistent query-speed advantage. Both formats produce matching analytical answers.</w:t>
+        <w:t>Text occupies 67,081,701 logical bytes; RCFile occupies 6,622,922 bytes, approximately 90.13% less. Replicated sizes are twice these values. Both formats return matching answers. RCFile is slightly faster for one query and slower for the other, so this run supports storage savings rather than a consistent speed advantage.</w:t>
       </w:r>
     </w:p>
     <w:p>
@@ -3954,7 +2640,7 @@
         <w:pStyle w:val="Heading1"/>
       </w:pPr>
       <w:r>
-        <w:t>8. Conclusion and References</w:t>
+        <w:t>10. Conclusion and References</w:t>
       </w:r>
     </w:p>
     <w:p>
@@ -3965,7 +2651,7 @@
         <w:rPr>
           <w:b w:val="0"/>
         </w:rPr>
-        <w:t>The project implements all three core themes on a linked 50,000-food development dataset containing 1,126,928 nutrient observations. MongoDB ingestion and aggregation, HDFS file operations, YARN Streaming, distributed Pig transformation and Hive Text/RCFile queries form a repeatable, checked workflow.</w:t>
+        <w:t>The implementation covers MongoDB ingestion, indexing and aggregation; HDFS file operations and YARN Streaming; Pig transformation; and Hive Text/RCFile comparison. The linked development dataset contains 50,000 foods and 1,126,928 nutrient observations. Saved evidence connects the inputs to the calculated answers and cross-system checks.</w:t>
       </w:r>
     </w:p>
     <w:p>
@@ -3976,7 +2662,7 @@
         <w:rPr>
           <w:b w:val="0"/>
         </w:rPr>
-        <w:t>The indexed lookup examines one document instead of 50,000. Pig retains all prepared observations for this selected subset, and equivalent Hive tables return matching analytical summaries. Gzip RCFile substantially reduces stored bytes, while the measured query times are similar and depend on the question. The Flask extension exposes the inputs, outputs and verification commands in an accessible interface.</w:t>
+        <w:t>The index reduces documents examined from 50,000 to one. Hive returns matching results across formats, while gzip RCFile reduces logical storage by approximately 90.13%. Measured query times remain similar and vary by question. The workflow is presented through the Flask dashboard described in Assignment 2.</w:t>
       </w:r>
     </w:p>
     <w:p>

</xml_diff>